<commit_message>
feat: transparentar metodología IFRS 9 F4
</commit_message>
<xml_diff>
--- a/web/src/fixtures/demo/report-ifrs9.docx
+++ b/web/src/fixtures/demo/report-ifrs9.docx
@@ -163,7 +163,7 @@
           </w:tcPr>
           <w:p>
             <w:r>
-              <w:t>2026-07-16</w:t>
+              <w:t>2026-07-17</w:t>
             </w:r>
           </w:p>
         </w:tc>
@@ -183,7 +183,7 @@
         <w:rPr>
           <w:rFonts w:ascii="Consolas" w:hAnsi="Consolas"/>
         </w:rPr>
-        <w:t>config_hash=35d372e660ce3f908b77b5d566a9b0ebf2ff8d7c6540e715662779b5bf631d7a</w:t>
+        <w:t>config_hash=b5d31ebc27c4a4522bc05944aa4f259e32f301de28331c0a36276d566a3168e7</w:t>
       </w:r>
     </w:p>
     <w:p>
@@ -199,7 +199,7 @@
         <w:rPr>
           <w:rFonts w:ascii="Consolas" w:hAnsi="Consolas"/>
         </w:rPr>
-        <w:t>git_sha=f6eb9411cbea6ce3f4ada1f8892514918468e9bf</w:t>
+        <w:t>git_sha=0c8cffb69ba492f6440fb7fa31d13f34bbd15c1c</w:t>
       </w:r>
     </w:p>
     <w:p>
@@ -753,6 +753,79 @@
     <w:p>
       <w:r>
         <w:t>En el tratamiento de faltantes se rechaza toda variable con más de 99.00 % de valores faltantes.</w:t>
+      </w:r>
+    </w:p>
+    <w:p>
+      <w:pPr>
+        <w:pStyle w:val="Heading2"/>
+      </w:pPr>
+      <w:r>
+        <w:t>3.2 Ficha metodológica IFRS 9 / ECL</w:t>
+      </w:r>
+    </w:p>
+    <w:p>
+      <w:r>
+        <w:t>Esta ficha metodológica se deriva del config efectivo y de las cards publicadas por la corrida; no replica parámetros ni supone que una capacidad configurada se ejecutó.</w:t>
+      </w:r>
+    </w:p>
+    <w:p>
+      <w:r>
+        <w:t>Activo en esta corrida:</w:t>
+      </w:r>
+    </w:p>
+    <w:p>
+      <w:r>
+        <w:t>Curva PD lifetime: Discrete-time hazard. 6.000 filas · 1.502 eventos · horizonte 5 años</w:t>
+      </w:r>
+    </w:p>
+    <w:p>
+      <w:r>
+        <w:t>Base de PD: TTC (through-the-cycle). La term-structure activa proviene de survival.</w:t>
+      </w:r>
+    </w:p>
+    <w:p>
+      <w:r>
+        <w:t>LGD y EAD: LGD provided · EAD provided. La EAD se mantiene constante por período (FALTA-DATO-IFRS-4).</w:t>
+      </w:r>
+    </w:p>
+    <w:p>
+      <w:r>
+        <w:t>Staging: 30/90 días + is_default. Stage 2 desde 30 días; Stage 3 desde 90 días o is_default.</w:t>
+      </w:r>
+    </w:p>
+    <w:p>
+      <w:r>
+        <w:t>Escenario de cálculo: Base 100 %. Escenario único; no hay ponderación macroeconómica múltiple.</w:t>
+      </w:r>
+    </w:p>
+    <w:p>
+      <w:r>
+        <w:t>Descuento: EIR anual. Descuento período a período con la columna eir.</w:t>
+      </w:r>
+    </w:p>
+    <w:p>
+      <w:r>
+        <w:t>Capacidad no ejercida en esta corrida:</w:t>
+      </w:r>
+    </w:p>
+    <w:p>
+      <w:r>
+        <w:t>Forward-looking: Capacidad no ejercida. La sección forward está inactiva y no condiciona la PD de esta corrida.</w:t>
+      </w:r>
+    </w:p>
+    <w:p>
+      <w:r>
+        <w:t>Escenarios macroeconómicos múltiples: Capacidad no ejercida. La corrida usa un único escenario base, sin ponderación macro múltiple.</w:t>
+      </w:r>
+    </w:p>
+    <w:p>
+      <w:r>
+        <w:t>Matrices de transición Markov: Capacidad no ejercida. La term-structure activa proviene de survival, no de Markov.</w:t>
+      </w:r>
+    </w:p>
+    <w:p>
+      <w:r>
+        <w:t>Fuentes técnicas: config.survival, survival.card, config.provisioning_ifrs9, provisioning_ifrs9.card.</w:t>
       </w:r>
     </w:p>
     <w:p>
@@ -2088,7 +2161,7 @@
         <w:rPr>
           <w:rFonts w:ascii="Consolas" w:hAnsi="Consolas"/>
         </w:rPr>
-        <w:t>35d372e660ce3f908b77b5d566a9b0ebf2ff8d7c6540e715662779b5bf631d7a</w:t>
+        <w:t>b5d31ebc27c4a4522bc05944aa4f259e32f301de28331c0a36276d566a3168e7</w:t>
       </w:r>
     </w:p>
     <w:p>
@@ -2104,7 +2177,7 @@
         <w:rPr>
           <w:rFonts w:ascii="Consolas" w:hAnsi="Consolas"/>
         </w:rPr>
-        <w:t>2026-07-16T23:00:42.568432Z</w:t>
+        <w:t>2026-07-17T01:31:38.370230Z</w:t>
       </w:r>
     </w:p>
     <w:p>
@@ -2168,7 +2241,7 @@
         <w:rPr>
           <w:rFonts w:ascii="Consolas" w:hAnsi="Consolas"/>
         </w:rPr>
-        <w:t>f6eb9411cbea6ce3f4ada1f8892514918468e9bf</w:t>
+        <w:t>0c8cffb69ba492f6440fb7fa31d13f34bbd15c1c</w:t>
       </w:r>
     </w:p>
     <w:p>
@@ -2315,6 +2388,1032 @@
     <w:p>
       <w:r>
         <w:t>Este anexo reproduce el payload completo de cada etapa: los parámetros efectivos y las métricas estructuradas tal como las publicó cada step, sin resumir.</w:t>
+      </w:r>
+    </w:p>
+    <w:p>
+      <w:pPr>
+        <w:pStyle w:val="Heading2"/>
+      </w:pPr>
+      <w:r>
+        <w:t>C.1 Supervivencia y curva PD lifetime</w:t>
+      </w:r>
+    </w:p>
+    <w:p>
+      <w:r>
+        <w:rPr>
+          <w:rFonts w:ascii="Consolas" w:hAnsi="Consolas"/>
+        </w:rPr>
+        <w:t>Artefacto de origen: survival.card</w:t>
+      </w:r>
+    </w:p>
+    <w:p>
+      <w:pPr>
+        <w:pStyle w:val="Heading3"/>
+      </w:pPr>
+      <w:r>
+        <w:t>Parámetros y payload</w:t>
+      </w:r>
+    </w:p>
+    <w:p>
+      <w:r>
+        <w:rPr>
+          <w:b/>
+        </w:rPr>
+        <w:t>dependency_versions</w:t>
+      </w:r>
+    </w:p>
+    <w:p>
+      <w:r>
+        <w:rPr>
+          <w:rFonts w:ascii="Consolas" w:hAnsi="Consolas"/>
+        </w:rPr>
+        <w:t>{</w:t>
+        <w:br/>
+        <w:t xml:space="preserve">  "numpy": "2.4.6",</w:t>
+        <w:br/>
+        <w:t xml:space="preserve">  "pandas": "2.3.3",</w:t>
+        <w:br/>
+        <w:t xml:space="preserve">  "statsmodels": "0.14.6"</w:t>
+        <w:br/>
+        <w:t>}</w:t>
+      </w:r>
+    </w:p>
+    <w:p>
+      <w:r>
+        <w:rPr>
+          <w:b/>
+        </w:rPr>
+        <w:t>diagnostics</w:t>
+      </w:r>
+    </w:p>
+    <w:p>
+      <w:r>
+        <w:rPr>
+          <w:rFonts w:ascii="Consolas" w:hAnsi="Consolas"/>
+        </w:rPr>
+        <w:t>{</w:t>
+        <w:br/>
+        <w:t xml:space="preserve">  "aft_family": null,</w:t>
+        <w:br/>
+        <w:t xml:space="preserve">  "fit_statistics": {</w:t>
+        <w:br/>
+        <w:t xml:space="preserve">    "aic": "11002.310349",</w:t>
+        <w:br/>
+        <w:t xml:space="preserve">    "converged": "True",</w:t>
+        <w:br/>
+        <w:t xml:space="preserve">    "deviance": "10984.310349",</w:t>
+        <w:br/>
+        <w:t xml:space="preserve">    "df_model": 8,</w:t>
+        <w:br/>
+        <w:t xml:space="preserve">    "df_resid": 26636,</w:t>
+        <w:br/>
+        <w:t xml:space="preserve">    "llf": "-5492.155174",</w:t>
+        <w:br/>
+        <w:t xml:space="preserve">    "n_iterations": 6,</w:t>
+        <w:br/>
+        <w:t xml:space="preserve">    "n_obs": 26645</w:t>
+        <w:br/>
+        <w:t xml:space="preserve">  },</w:t>
+        <w:br/>
+        <w:t xml:space="preserve">  "link": "logit",</w:t>
+        <w:br/>
+        <w:t xml:space="preserve">  "max_observed_time": "5.000000",</w:t>
+        <w:br/>
+        <w:t xml:space="preserve">  "method": "discrete_hazard",</w:t>
+        <w:br/>
+        <w:t xml:space="preserve">  "n_censored": 4498,</w:t>
+        <w:br/>
+        <w:t xml:space="preserve">  "n_events": 1502,</w:t>
+        <w:br/>
+        <w:t xml:space="preserve">  "n_rows": 6000,</w:t>
+        <w:br/>
+        <w:t xml:space="preserve">  "schoenfeld_test": null,</w:t>
+        <w:br/>
+        <w:t xml:space="preserve">  "warnings": []</w:t>
+        <w:br/>
+        <w:t>}</w:t>
+      </w:r>
+    </w:p>
+    <w:p>
+      <w:r>
+        <w:rPr>
+          <w:b/>
+        </w:rPr>
+        <w:t>duration_col</w:t>
+      </w:r>
+    </w:p>
+    <w:p>
+      <w:r>
+        <w:rPr>
+          <w:rFonts w:ascii="Consolas" w:hAnsi="Consolas"/>
+        </w:rPr>
+        <w:t>duration</w:t>
+      </w:r>
+    </w:p>
+    <w:p>
+      <w:r>
+        <w:rPr>
+          <w:b/>
+        </w:rPr>
+        <w:t>effective_config</w:t>
+      </w:r>
+    </w:p>
+    <w:p>
+      <w:r>
+        <w:rPr>
+          <w:rFonts w:ascii="Consolas" w:hAnsi="Consolas"/>
+        </w:rPr>
+        <w:t>{</w:t>
+        <w:br/>
+        <w:t xml:space="preserve">  "cox_aft": {</w:t>
+        <w:br/>
+        <w:t xml:space="preserve">    "aft_family": null,</w:t>
+        <w:br/>
+        <w:t xml:space="preserve">    "ph_p_value_threshold": null,</w:t>
+        <w:br/>
+        <w:t xml:space="preserve">    "ph_test_enabled": true</w:t>
+        <w:br/>
+        <w:t xml:space="preserve">  },</w:t>
+        <w:br/>
+        <w:t xml:space="preserve">  "discrete_hazard": {</w:t>
+        <w:br/>
+        <w:t xml:space="preserve">    "include_period_dummies": true,</w:t>
+        <w:br/>
+        <w:t xml:space="preserve">    "link": "logit",</w:t>
+        <w:br/>
+        <w:t xml:space="preserve">    "min_events_per_period": null,</w:t>
+        <w:br/>
+        <w:t xml:space="preserve">    "pd_role": "none"</w:t>
+        <w:br/>
+        <w:t xml:space="preserve">  },</w:t>
+        <w:br/>
+        <w:t xml:space="preserve">  "fail_on_falta_dato": true,</w:t>
+        <w:br/>
+        <w:t xml:space="preserve">  "input": {</w:t>
+        <w:br/>
+        <w:t xml:space="preserve">    "covariate_cols": [</w:t>
+        <w:br/>
+        <w:t xml:space="preserve">      "days_past_due",</w:t>
+        <w:br/>
+        <w:t xml:space="preserve">      "utilizacion_linea",</w:t>
+        <w:br/>
+        <w:t xml:space="preserve">      "deuda_ingreso",</w:t>
+        <w:br/>
+        <w:t xml:space="preserve">      "antiguedad_meses"</w:t>
+        <w:br/>
+        <w:t xml:space="preserve">    ],</w:t>
+        <w:br/>
+        <w:t xml:space="preserve">    "duration_col": "duration",</w:t>
+        <w:br/>
+        <w:t xml:space="preserve">    "event_col": "event",</w:t>
+        <w:br/>
+        <w:t xml:space="preserve">    "id_col": null,</w:t>
+        <w:br/>
+        <w:t xml:space="preserve">    "linear_predictor_column": "linear_predictor",</w:t>
+        <w:br/>
+        <w:t xml:space="preserve">    "pd_column": "pd_raw",</w:t>
+        <w:br/>
+        <w:t xml:space="preserve">    "pd_source": "none",</w:t>
+        <w:br/>
+        <w:t xml:space="preserve">    "segment_col": null</w:t>
+        <w:br/>
+        <w:t xml:space="preserve">  },</w:t>
+        <w:br/>
+        <w:t xml:space="preserve">  "kaplan_meier": {</w:t>
+        <w:br/>
+        <w:t xml:space="preserve">    "confidence_level": null,</w:t>
+        <w:br/>
+        <w:t xml:space="preserve">    "confidence_transform": null</w:t>
+        <w:br/>
+        <w:t xml:space="preserve">  },</w:t>
+        <w:br/>
+        <w:t xml:space="preserve">  "method": "discrete_hazard",</w:t>
+        <w:br/>
+        <w:t xml:space="preserve">  "schema_version": "1.0.0",</w:t>
+        <w:br/>
+        <w:t xml:space="preserve">  "time_grid": {</w:t>
+        <w:br/>
+        <w:t xml:space="preserve">    "evaluation_times": [],</w:t>
+        <w:br/>
+        <w:t xml:space="preserve">    "horizon_periods": 5,</w:t>
+        <w:br/>
+        <w:t xml:space="preserve">    "time_unit": "year"</w:t>
+        <w:br/>
+        <w:t xml:space="preserve">  },</w:t>
+        <w:br/>
+        <w:t xml:space="preserve">  "type": "standard"</w:t>
+        <w:br/>
+        <w:t>}</w:t>
+      </w:r>
+    </w:p>
+    <w:p>
+      <w:r>
+        <w:rPr>
+          <w:b/>
+        </w:rPr>
+        <w:t>event_col</w:t>
+      </w:r>
+    </w:p>
+    <w:p>
+      <w:r>
+        <w:rPr>
+          <w:rFonts w:ascii="Consolas" w:hAnsi="Consolas"/>
+        </w:rPr>
+        <w:t>event</w:t>
+      </w:r>
+    </w:p>
+    <w:p>
+      <w:r>
+        <w:rPr>
+          <w:b/>
+        </w:rPr>
+        <w:t>falta_dato</w:t>
+      </w:r>
+    </w:p>
+    <w:p>
+      <w:r>
+        <w:rPr>
+          <w:rFonts w:ascii="Consolas" w:hAnsi="Consolas"/>
+        </w:rPr>
+        <w:t>[]</w:t>
+      </w:r>
+    </w:p>
+    <w:p>
+      <w:r>
+        <w:rPr>
+          <w:b/>
+        </w:rPr>
+        <w:t>method</w:t>
+      </w:r>
+    </w:p>
+    <w:p>
+      <w:r>
+        <w:rPr>
+          <w:rFonts w:ascii="Consolas" w:hAnsi="Consolas"/>
+        </w:rPr>
+        <w:t>discrete_hazard</w:t>
+      </w:r>
+    </w:p>
+    <w:p>
+      <w:r>
+        <w:rPr>
+          <w:b/>
+        </w:rPr>
+        <w:t>n_events</w:t>
+      </w:r>
+    </w:p>
+    <w:p>
+      <w:r>
+        <w:rPr>
+          <w:rFonts w:ascii="Consolas" w:hAnsi="Consolas"/>
+        </w:rPr>
+        <w:t>1502</w:t>
+      </w:r>
+    </w:p>
+    <w:p>
+      <w:r>
+        <w:rPr>
+          <w:b/>
+        </w:rPr>
+        <w:t>n_periods</w:t>
+      </w:r>
+    </w:p>
+    <w:p>
+      <w:r>
+        <w:rPr>
+          <w:rFonts w:ascii="Consolas" w:hAnsi="Consolas"/>
+        </w:rPr>
+        <w:t>5</w:t>
+      </w:r>
+    </w:p>
+    <w:p>
+      <w:r>
+        <w:rPr>
+          <w:b/>
+        </w:rPr>
+        <w:t>n_rows</w:t>
+      </w:r>
+    </w:p>
+    <w:p>
+      <w:r>
+        <w:rPr>
+          <w:rFonts w:ascii="Consolas" w:hAnsi="Consolas"/>
+        </w:rPr>
+        <w:t>6000</w:t>
+      </w:r>
+    </w:p>
+    <w:p>
+      <w:r>
+        <w:rPr>
+          <w:b/>
+        </w:rPr>
+        <w:t>output_columns</w:t>
+      </w:r>
+    </w:p>
+    <w:p>
+      <w:r>
+        <w:rPr>
+          <w:rFonts w:ascii="Consolas" w:hAnsi="Consolas"/>
+        </w:rPr>
+        <w:t>[</w:t>
+        <w:br/>
+        <w:t xml:space="preserve">  "row_id",</w:t>
+        <w:br/>
+        <w:t xml:space="preserve">  "segment",</w:t>
+        <w:br/>
+        <w:t xml:space="preserve">  "partition",</w:t>
+        <w:br/>
+        <w:t xml:space="preserve">  "period",</w:t>
+        <w:br/>
+        <w:t xml:space="preserve">  "time_value",</w:t>
+        <w:br/>
+        <w:t xml:space="preserve">  "hazard",</w:t>
+        <w:br/>
+        <w:t xml:space="preserve">  "survival",</w:t>
+        <w:br/>
+        <w:t xml:space="preserve">  "pd_marginal",</w:t>
+        <w:br/>
+        <w:t xml:space="preserve">  "pd_cumulative",</w:t>
+        <w:br/>
+        <w:t xml:space="preserve">  "method",</w:t>
+        <w:br/>
+        <w:t xml:space="preserve">  "pd_source",</w:t>
+        <w:br/>
+        <w:t xml:space="preserve">  "scenario",</w:t>
+        <w:br/>
+        <w:t xml:space="preserve">  "warning_codes"</w:t>
+        <w:br/>
+        <w:t>]</w:t>
+      </w:r>
+    </w:p>
+    <w:p>
+      <w:r>
+        <w:rPr>
+          <w:b/>
+        </w:rPr>
+        <w:t>pd_source</w:t>
+      </w:r>
+    </w:p>
+    <w:p>
+      <w:r>
+        <w:rPr>
+          <w:rFonts w:ascii="Consolas" w:hAnsi="Consolas"/>
+        </w:rPr>
+        <w:t>none</w:t>
+      </w:r>
+    </w:p>
+    <w:p>
+      <w:r>
+        <w:rPr>
+          <w:b/>
+        </w:rPr>
+        <w:t>time_unit</w:t>
+      </w:r>
+    </w:p>
+    <w:p>
+      <w:r>
+        <w:rPr>
+          <w:rFonts w:ascii="Consolas" w:hAnsi="Consolas"/>
+        </w:rPr>
+        <w:t>year</w:t>
+      </w:r>
+    </w:p>
+    <w:p>
+      <w:pPr>
+        <w:pStyle w:val="Heading3"/>
+      </w:pPr>
+      <w:r>
+        <w:t>Métricas estructuradas</w:t>
+      </w:r>
+    </w:p>
+    <w:p>
+      <w:r>
+        <w:rPr>
+          <w:b/>
+        </w:rPr>
+        <w:t>km_greenwood</w:t>
+      </w:r>
+    </w:p>
+    <w:p>
+      <w:r>
+        <w:rPr>
+          <w:rFonts w:ascii="Consolas" w:hAnsi="Consolas"/>
+        </w:rPr>
+        <w:t>{}</w:t>
+      </w:r>
+    </w:p>
+    <w:p>
+      <w:r>
+        <w:rPr>
+          <w:b/>
+        </w:rPr>
+        <w:t>pd_source</w:t>
+      </w:r>
+    </w:p>
+    <w:p>
+      <w:r>
+        <w:rPr>
+          <w:rFonts w:ascii="Consolas" w:hAnsi="Consolas"/>
+        </w:rPr>
+        <w:t>{</w:t>
+        <w:br/>
+        <w:t xml:space="preserve">  "coverage_column": null,</w:t>
+        <w:br/>
+        <w:t xml:space="preserve">  "linear_predictor_column": null,</w:t>
+        <w:br/>
+        <w:t xml:space="preserve">  "pd_column": null,</w:t>
+        <w:br/>
+        <w:t xml:space="preserve">  "pd_coverage": null,</w:t>
+        <w:br/>
+        <w:t xml:space="preserve">  "pd_rows": null,</w:t>
+        <w:br/>
+        <w:t xml:space="preserve">  "pd_source": "none",</w:t>
+        <w:br/>
+        <w:t xml:space="preserve">  "rows_without_match": [],</w:t>
+        <w:br/>
+        <w:t xml:space="preserve">  "source_artifact": null</w:t>
+        <w:br/>
+        <w:t>}</w:t>
+      </w:r>
+    </w:p>
+    <w:p>
+      <w:r>
+        <w:rPr>
+          <w:b/>
+        </w:rPr>
+        <w:t>person_period</w:t>
+      </w:r>
+    </w:p>
+    <w:p>
+      <w:r>
+        <w:rPr>
+          <w:rFonts w:ascii="Consolas" w:hAnsi="Consolas"/>
+        </w:rPr>
+        <w:t>{</w:t>
+        <w:br/>
+        <w:t xml:space="preserve">  "events_by_period": {</w:t>
+        <w:br/>
+        <w:t xml:space="preserve">    "1": 374,</w:t>
+        <w:br/>
+        <w:t xml:space="preserve">    "2": 339,</w:t>
+        <w:br/>
+        <w:t xml:space="preserve">    "3": 286,</w:t>
+        <w:br/>
+        <w:t xml:space="preserve">    "4": 270,</w:t>
+        <w:br/>
+        <w:t xml:space="preserve">    "5": 233</w:t>
+        <w:br/>
+        <w:t xml:space="preserve">  },</w:t>
+        <w:br/>
+        <w:t xml:space="preserve">  "n_rows": 26645</w:t>
+        <w:br/>
+        <w:t>}</w:t>
+      </w:r>
+    </w:p>
+    <w:p>
+      <w:r>
+        <w:rPr>
+          <w:b/>
+        </w:rPr>
+        <w:t>schoenfeld</w:t>
+      </w:r>
+    </w:p>
+    <w:p>
+      <w:r>
+        <w:rPr>
+          <w:rFonts w:ascii="Consolas" w:hAnsi="Consolas"/>
+        </w:rPr>
+        <w:t>{}</w:t>
+      </w:r>
+    </w:p>
+    <w:p>
+      <w:r>
+        <w:rPr>
+          <w:b/>
+        </w:rPr>
+        <w:t>term_structure_summary</w:t>
+      </w:r>
+    </w:p>
+    <w:p>
+      <w:r>
+        <w:rPr>
+          <w:rFonts w:ascii="Consolas" w:hAnsi="Consolas"/>
+        </w:rPr>
+        <w:t>{</w:t>
+        <w:br/>
+        <w:t xml:space="preserve">  "max_pd_cumulative": "0.995033",</w:t>
+        <w:br/>
+        <w:t xml:space="preserve">  "min_survival": "0.004967",</w:t>
+        <w:br/>
+        <w:t xml:space="preserve">  "n_periods": 5,</w:t>
+        <w:br/>
+        <w:t xml:space="preserve">  "n_rows": 30000</w:t>
+        <w:br/>
+        <w:t>}</w:t>
+      </w:r>
+    </w:p>
+    <w:p>
+      <w:r>
+        <w:rPr>
+          <w:b/>
+        </w:rPr>
+        <w:t>time_grid</w:t>
+      </w:r>
+    </w:p>
+    <w:p>
+      <w:r>
+        <w:rPr>
+          <w:rFonts w:ascii="Consolas" w:hAnsi="Consolas"/>
+        </w:rPr>
+        <w:t>{</w:t>
+        <w:br/>
+        <w:t xml:space="preserve">  "evaluation_times": [],</w:t>
+        <w:br/>
+        <w:t xml:space="preserve">  "horizon_periods": 5,</w:t>
+        <w:br/>
+        <w:t xml:space="preserve">  "resolved_times": [</w:t>
+        <w:br/>
+        <w:t xml:space="preserve">    1,</w:t>
+        <w:br/>
+        <w:t xml:space="preserve">    2,</w:t>
+        <w:br/>
+        <w:t xml:space="preserve">    3,</w:t>
+        <w:br/>
+        <w:t xml:space="preserve">    4,</w:t>
+        <w:br/>
+        <w:t xml:space="preserve">    5</w:t>
+        <w:br/>
+        <w:t xml:space="preserve">  ],</w:t>
+        <w:br/>
+        <w:t xml:space="preserve">  "source": "horizon_periods",</w:t>
+        <w:br/>
+        <w:t xml:space="preserve">  "time_unit": "year",</w:t>
+        <w:br/>
+        <w:t xml:space="preserve">  "warnings": []</w:t>
+        <w:br/>
+        <w:t>}</w:t>
+      </w:r>
+    </w:p>
+    <w:p>
+      <w:pPr>
+        <w:pStyle w:val="Heading2"/>
+      </w:pPr>
+      <w:r>
+        <w:t>C.2 Pérdida crediticia esperada (ECL) por etapas</w:t>
+      </w:r>
+    </w:p>
+    <w:p>
+      <w:r>
+        <w:rPr>
+          <w:rFonts w:ascii="Consolas" w:hAnsi="Consolas"/>
+        </w:rPr>
+        <w:t>Artefacto de origen: provisioning_ifrs9.card</w:t>
+      </w:r>
+    </w:p>
+    <w:p>
+      <w:pPr>
+        <w:pStyle w:val="Heading3"/>
+      </w:pPr>
+      <w:r>
+        <w:t>Parámetros y payload</w:t>
+      </w:r>
+    </w:p>
+    <w:p>
+      <w:r>
+        <w:rPr>
+          <w:b/>
+        </w:rPr>
+        <w:t>as_of_date</w:t>
+      </w:r>
+    </w:p>
+    <w:p>
+      <w:r>
+        <w:rPr>
+          <w:rFonts w:ascii="Consolas" w:hAnsi="Consolas"/>
+        </w:rPr>
+        <w:t>2025-06-30</w:t>
+      </w:r>
+    </w:p>
+    <w:p>
+      <w:r>
+        <w:rPr>
+          <w:b/>
+        </w:rPr>
+        <w:t>dependency_versions</w:t>
+      </w:r>
+    </w:p>
+    <w:p>
+      <w:r>
+        <w:rPr>
+          <w:rFonts w:ascii="Consolas" w:hAnsi="Consolas"/>
+        </w:rPr>
+        <w:t>{</w:t>
+        <w:br/>
+        <w:t xml:space="preserve">  "numpy": "2.4.6",</w:t>
+        <w:br/>
+        <w:t xml:space="preserve">  "pandas": "2.3.3"</w:t>
+        <w:br/>
+        <w:t>}</w:t>
+      </w:r>
+    </w:p>
+    <w:p>
+      <w:r>
+        <w:rPr>
+          <w:b/>
+        </w:rPr>
+        <w:t>effective_config</w:t>
+      </w:r>
+    </w:p>
+    <w:p>
+      <w:r>
+        <w:rPr>
+          <w:rFonts w:ascii="Consolas" w:hAnsi="Consolas"/>
+        </w:rPr>
+        <w:t>{</w:t>
+        <w:br/>
+        <w:t xml:space="preserve">  "as_of_date_col": "as_of_date",</w:t>
+        <w:br/>
+        <w:t xml:space="preserve">  "ead": {</w:t>
+        <w:br/>
+        <w:t xml:space="preserve">    "ccf_col": null,</w:t>
+        <w:br/>
+        <w:t xml:space="preserve">    "ccf_value": null,</w:t>
+        <w:br/>
+        <w:t xml:space="preserve">    "drawn_col": "drawn",</w:t>
+        <w:br/>
+        <w:t xml:space="preserve">    "ead_col": "ead",</w:t>
+        <w:br/>
+        <w:t xml:space="preserve">    "exposure_profile_col": null,</w:t>
+        <w:br/>
+        <w:t xml:space="preserve">    "limit_col": "credit_limit",</w:t>
+        <w:br/>
+        <w:t xml:space="preserve">    "method": "provided"</w:t>
+        <w:br/>
+        <w:t xml:space="preserve">  },</w:t>
+        <w:br/>
+        <w:t xml:space="preserve">  "ecl": {</w:t>
+        <w:br/>
+        <w:t xml:space="preserve">    "discount_convention": "annual_eir_year_fraction",</w:t>
+        <w:br/>
+        <w:t xml:space="preserve">    "eir_col": "eir",</w:t>
+        <w:br/>
+        <w:t xml:space="preserve">    "rounding": "none",</w:t>
+        <w:br/>
+        <w:t xml:space="preserve">    "stage3_direct": false</w:t>
+        <w:br/>
+        <w:t xml:space="preserve">  },</w:t>
+        <w:br/>
+        <w:t xml:space="preserve">  "fail_on_falta_dato": true,</w:t>
+        <w:br/>
+        <w:t xml:space="preserve">  "lgd": {</w:t>
+        <w:br/>
+        <w:t xml:space="preserve">    "covariate_cols": [],</w:t>
+        <w:br/>
+        <w:t xml:space="preserve">    "lgd_cap": "1.000000",</w:t>
+        <w:br/>
+        <w:t xml:space="preserve">    "lgd_col": "lgd",</w:t>
+        <w:br/>
+        <w:t xml:space="preserve">    "lgd_floor": "0.000000",</w:t>
+        <w:br/>
+        <w:t xml:space="preserve">    "method": "provided",</w:t>
+        <w:br/>
+        <w:t xml:space="preserve">    "recovery_col": null,</w:t>
+        <w:br/>
+        <w:t xml:space="preserve">    "workout_discount": "eir"</w:t>
+        <w:br/>
+        <w:t xml:space="preserve">  },</w:t>
+        <w:br/>
+        <w:t xml:space="preserve">  "pd": {</w:t>
+        <w:br/>
+        <w:t xml:space="preserve">    "base_pd_source": "term_structure",</w:t>
+        <w:br/>
+        <w:t xml:space="preserve">    "horizon_12m_periods": 1,</w:t>
+        <w:br/>
+        <w:t xml:space="preserve">    "max_lifetime_periods": null,</w:t>
+        <w:br/>
+        <w:t xml:space="preserve">    "pit_mode": "ttc_only",</w:t>
+        <w:br/>
+        <w:t xml:space="preserve">    "rho": null,</w:t>
+        <w:br/>
+        <w:t xml:space="preserve">    "rho_col": null,</w:t>
+        <w:br/>
+        <w:t xml:space="preserve">    "systemic_factor_col": null,</w:t>
+        <w:br/>
+        <w:t xml:space="preserve">    "term_structure_source": "survival"</w:t>
+        <w:br/>
+        <w:t xml:space="preserve">  },</w:t>
+        <w:br/>
+        <w:t xml:space="preserve">  "portfolio_col": "portfolio",</w:t>
+        <w:br/>
+        <w:t xml:space="preserve">  "row_id_col": null,</w:t>
+        <w:br/>
+        <w:t xml:space="preserve">  "scenarios": {</w:t>
+        <w:br/>
+        <w:t xml:space="preserve">    "forbid_mean_scenario": true,</w:t>
+        <w:br/>
+        <w:t xml:space="preserve">    "source": "single",</w:t>
+        <w:br/>
+        <w:t xml:space="preserve">    "weights": {}</w:t>
+        <w:br/>
+        <w:t xml:space="preserve">  },</w:t>
+        <w:br/>
+        <w:t xml:space="preserve">  "schema_version": "1.0.0",</w:t>
+        <w:br/>
+        <w:t xml:space="preserve">  "staging": {</w:t>
+        <w:br/>
+        <w:t xml:space="preserve">    "days_past_due_col": "days_past_due",</w:t>
+        <w:br/>
+        <w:t xml:space="preserve">    "dpd_default_backstop": 90,</w:t>
+        <w:br/>
+        <w:t xml:space="preserve">    "dpd_sicr_backstop": 30,</w:t>
+        <w:br/>
+        <w:t xml:space="preserve">    "is_default_col": "is_default",</w:t>
+        <w:br/>
+        <w:t xml:space="preserve">    "low_credit_risk_col": null,</w:t>
+        <w:br/>
+        <w:t xml:space="preserve">    "low_credit_risk_exemption": false,</w:t>
+        <w:br/>
+        <w:t xml:space="preserve">    "notch_downgrade_threshold": null,</w:t>
+        <w:br/>
+        <w:t xml:space="preserve">    "origination_pd_life_col": null,</w:t>
+        <w:br/>
+        <w:t xml:space="preserve">    "origination_rating_col": null,</w:t>
+        <w:br/>
+        <w:t xml:space="preserve">    "rating_col": null,</w:t>
+        <w:br/>
+        <w:t xml:space="preserve">    "sicr_pd_pit_backstop_multiple": "3.000000",</w:t>
+        <w:br/>
+        <w:t xml:space="preserve">    "sicr_pd_ratio_threshold": "2.000000",</w:t>
+        <w:br/>
+        <w:t xml:space="preserve">    "stage_override_col": null</w:t>
+        <w:br/>
+        <w:t xml:space="preserve">  },</w:t>
+        <w:br/>
+        <w:t xml:space="preserve">  "type": "standard"</w:t>
+        <w:br/>
+        <w:t>}</w:t>
+      </w:r>
+    </w:p>
+    <w:p>
+      <w:r>
+        <w:rPr>
+          <w:b/>
+        </w:rPr>
+        <w:t>falta_dato</w:t>
+      </w:r>
+    </w:p>
+    <w:p>
+      <w:r>
+        <w:rPr>
+          <w:rFonts w:ascii="Consolas" w:hAnsi="Consolas"/>
+        </w:rPr>
+        <w:t>[</w:t>
+        <w:br/>
+        <w:t xml:space="preserve">  "FALTA-DATO-IFRS-4"</w:t>
+        <w:br/>
+        <w:t>]</w:t>
+      </w:r>
+    </w:p>
+    <w:p>
+      <w:r>
+        <w:rPr>
+          <w:b/>
+        </w:rPr>
+        <w:t>n_rows</w:t>
+      </w:r>
+    </w:p>
+    <w:p>
+      <w:r>
+        <w:rPr>
+          <w:rFonts w:ascii="Consolas" w:hAnsi="Consolas"/>
+        </w:rPr>
+        <w:t>6000</w:t>
+      </w:r>
+    </w:p>
+    <w:p>
+      <w:r>
+        <w:rPr>
+          <w:b/>
+        </w:rPr>
+        <w:t>n_stage1</w:t>
+      </w:r>
+    </w:p>
+    <w:p>
+      <w:r>
+        <w:rPr>
+          <w:rFonts w:ascii="Consolas" w:hAnsi="Consolas"/>
+        </w:rPr>
+        <w:t>5235</w:t>
+      </w:r>
+    </w:p>
+    <w:p>
+      <w:r>
+        <w:rPr>
+          <w:b/>
+        </w:rPr>
+        <w:t>n_stage2</w:t>
+      </w:r>
+    </w:p>
+    <w:p>
+      <w:r>
+        <w:rPr>
+          <w:rFonts w:ascii="Consolas" w:hAnsi="Consolas"/>
+        </w:rPr>
+        <w:t>477</w:t>
+      </w:r>
+    </w:p>
+    <w:p>
+      <w:r>
+        <w:rPr>
+          <w:b/>
+        </w:rPr>
+        <w:t>n_stage3</w:t>
+      </w:r>
+    </w:p>
+    <w:p>
+      <w:r>
+        <w:rPr>
+          <w:rFonts w:ascii="Consolas" w:hAnsi="Consolas"/>
+        </w:rPr>
+        <w:t>288</w:t>
+      </w:r>
+    </w:p>
+    <w:p>
+      <w:r>
+        <w:rPr>
+          <w:b/>
+        </w:rPr>
+        <w:t>pit_mode</w:t>
+      </w:r>
+    </w:p>
+    <w:p>
+      <w:r>
+        <w:rPr>
+          <w:rFonts w:ascii="Consolas" w:hAnsi="Consolas"/>
+        </w:rPr>
+        <w:t>ttc_only</w:t>
+      </w:r>
+    </w:p>
+    <w:p>
+      <w:r>
+        <w:rPr>
+          <w:b/>
+        </w:rPr>
+        <w:t>scenario_weights</w:t>
+      </w:r>
+    </w:p>
+    <w:p>
+      <w:r>
+        <w:rPr>
+          <w:rFonts w:ascii="Consolas" w:hAnsi="Consolas"/>
+        </w:rPr>
+        <w:t>{</w:t>
+        <w:br/>
+        <w:t xml:space="preserve">  "base": "1.000000"</w:t>
+        <w:br/>
+        <w:t>}</w:t>
+      </w:r>
+    </w:p>
+    <w:p>
+      <w:r>
+        <w:rPr>
+          <w:b/>
+        </w:rPr>
+        <w:t>scenarios</w:t>
+      </w:r>
+    </w:p>
+    <w:p>
+      <w:r>
+        <w:rPr>
+          <w:rFonts w:ascii="Consolas" w:hAnsi="Consolas"/>
+        </w:rPr>
+        <w:t>[</w:t>
+        <w:br/>
+        <w:t xml:space="preserve">  "base"</w:t>
+        <w:br/>
+        <w:t>]</w:t>
+      </w:r>
+    </w:p>
+    <w:p>
+      <w:r>
+        <w:rPr>
+          <w:b/>
+        </w:rPr>
+        <w:t>term_structure_source</w:t>
+      </w:r>
+    </w:p>
+    <w:p>
+      <w:r>
+        <w:rPr>
+          <w:rFonts w:ascii="Consolas" w:hAnsi="Consolas"/>
+        </w:rPr>
+        <w:t>survival</w:t>
+      </w:r>
+    </w:p>
+    <w:p>
+      <w:r>
+        <w:rPr>
+          <w:b/>
+        </w:rPr>
+        <w:t>total_ead</w:t>
+      </w:r>
+    </w:p>
+    <w:p>
+      <w:r>
+        <w:rPr>
+          <w:rFonts w:ascii="Consolas" w:hAnsi="Consolas"/>
+        </w:rPr>
+        <w:t>114325314.700000</w:t>
+      </w:r>
+    </w:p>
+    <w:p>
+      <w:r>
+        <w:rPr>
+          <w:b/>
+        </w:rPr>
+        <w:t>total_ecl_reported</w:t>
+      </w:r>
+    </w:p>
+    <w:p>
+      <w:r>
+        <w:rPr>
+          <w:rFonts w:ascii="Consolas" w:hAnsi="Consolas"/>
+        </w:rPr>
+        <w:t>3423116.118598</w:t>
+      </w:r>
+    </w:p>
+    <w:p>
+      <w:pPr>
+        <w:pStyle w:val="Heading3"/>
+      </w:pPr>
+      <w:r>
+        <w:t>Métricas estructuradas</w:t>
+      </w:r>
+    </w:p>
+    <w:p>
+      <w:r>
+        <w:rPr>
+          <w:b/>
+        </w:rPr>
+        <w:t>ecl_by_scenario</w:t>
+      </w:r>
+    </w:p>
+    <w:p>
+      <w:r>
+        <w:rPr>
+          <w:rFonts w:ascii="Consolas" w:hAnsi="Consolas"/>
+        </w:rPr>
+        <w:t>{</w:t>
+        <w:br/>
+        <w:t xml:space="preserve">  "base": "6911516.428053"</w:t>
+        <w:br/>
+        <w:t>}</w:t>
+      </w:r>
+    </w:p>
+    <w:p>
+      <w:r>
+        <w:rPr>
+          <w:b/>
+        </w:rPr>
+        <w:t>staging_migration</w:t>
+      </w:r>
+    </w:p>
+    <w:p>
+      <w:r>
+        <w:rPr>
+          <w:rFonts w:ascii="Consolas" w:hAnsi="Consolas"/>
+        </w:rPr>
+        <w:t>{</w:t>
+        <w:br/>
+        <w:t xml:space="preserve">  "stage_1": 5235,</w:t>
+        <w:br/>
+        <w:t xml:space="preserve">  "stage_2": 477,</w:t>
+        <w:br/>
+        <w:t xml:space="preserve">  "stage_3": 288</w:t>
+        <w:br/>
+        <w:t>}</w:t>
+      </w:r>
+    </w:p>
+    <w:p>
+      <w:r>
+        <w:rPr>
+          <w:b/>
+        </w:rPr>
+        <w:t>term_structure_summary</w:t>
+      </w:r>
+    </w:p>
+    <w:p>
+      <w:r>
+        <w:rPr>
+          <w:rFonts w:ascii="Consolas" w:hAnsi="Consolas"/>
+        </w:rPr>
+        <w:t>{</w:t>
+        <w:br/>
+        <w:t xml:space="preserve">  "n_rows": 30000,</w:t>
+        <w:br/>
+        <w:t xml:space="preserve">  "n_scenarios": 1</w:t>
+        <w:br/>
+        <w:t>}</w:t>
       </w:r>
     </w:p>
     <w:sectPr>

</xml_diff>

<commit_message>
chore(demo): recaptura fixtures F4 IFRS 9 (IBK-04)
</commit_message>
<xml_diff>
--- a/web/src/fixtures/demo/report-ifrs9.docx
+++ b/web/src/fixtures/demo/report-ifrs9.docx
@@ -183,7 +183,7 @@
         <w:rPr>
           <w:rFonts w:ascii="Consolas" w:hAnsi="Consolas"/>
         </w:rPr>
-        <w:t>config_hash=b5d31ebc27c4a4522bc05944aa4f259e32f301de28331c0a36276d566a3168e7</w:t>
+        <w:t>config_hash=6ed12746631afd4991771d834e49fc5c264c8cd78dd8fa37aa4652dd22b8d28b</w:t>
       </w:r>
     </w:p>
     <w:p>
@@ -199,7 +199,7 @@
         <w:rPr>
           <w:rFonts w:ascii="Consolas" w:hAnsi="Consolas"/>
         </w:rPr>
-        <w:t>git_sha=0c8cffb69ba492f6440fb7fa31d13f34bbd15c1c</w:t>
+        <w:t>git_sha=2b161c7c94df91c227eeb64ca9a7cd068a2268a1</w:t>
       </w:r>
     </w:p>
     <w:p>
@@ -2161,7 +2161,7 @@
         <w:rPr>
           <w:rFonts w:ascii="Consolas" w:hAnsi="Consolas"/>
         </w:rPr>
-        <w:t>b5d31ebc27c4a4522bc05944aa4f259e32f301de28331c0a36276d566a3168e7</w:t>
+        <w:t>6ed12746631afd4991771d834e49fc5c264c8cd78dd8fa37aa4652dd22b8d28b</w:t>
       </w:r>
     </w:p>
     <w:p>
@@ -2177,7 +2177,7 @@
         <w:rPr>
           <w:rFonts w:ascii="Consolas" w:hAnsi="Consolas"/>
         </w:rPr>
-        <w:t>2026-07-17T01:31:38.370230Z</w:t>
+        <w:t>2026-07-17T21:34:58.235555Z</w:t>
       </w:r>
     </w:p>
     <w:p>
@@ -2241,7 +2241,7 @@
         <w:rPr>
           <w:rFonts w:ascii="Consolas" w:hAnsi="Consolas"/>
         </w:rPr>
-        <w:t>0c8cffb69ba492f6440fb7fa31d13f34bbd15c1c</w:t>
+        <w:t>2b161c7c94df91c227eeb64ca9a7cd068a2268a1</w:t>
       </w:r>
     </w:p>
     <w:p>

</xml_diff>

<commit_message>
chore(demo): recaptura fixtures F4 IFRS 9 (IBK-05, lineage 1.3.0)
</commit_message>
<xml_diff>
--- a/web/src/fixtures/demo/report-ifrs9.docx
+++ b/web/src/fixtures/demo/report-ifrs9.docx
@@ -163,7 +163,7 @@
           </w:tcPr>
           <w:p>
             <w:r>
-              <w:t>2026-07-17</w:t>
+              <w:t>2026-07-18</w:t>
             </w:r>
           </w:p>
         </w:tc>
@@ -183,7 +183,7 @@
         <w:rPr>
           <w:rFonts w:ascii="Consolas" w:hAnsi="Consolas"/>
         </w:rPr>
-        <w:t>config_hash=6ed12746631afd4991771d834e49fc5c264c8cd78dd8fa37aa4652dd22b8d28b</w:t>
+        <w:t>config_hash=a3771ff5abce44db4d226e51ce63bdf38a7fb00d3cc0c15f3a923b86448ba2a3</w:t>
       </w:r>
     </w:p>
     <w:p>
@@ -199,7 +199,7 @@
         <w:rPr>
           <w:rFonts w:ascii="Consolas" w:hAnsi="Consolas"/>
         </w:rPr>
-        <w:t>git_sha=2b161c7c94df91c227eeb64ca9a7cd068a2268a1</w:t>
+        <w:t>git_sha=ed86e9aa9ab912eb94a1fe4c4f6ade0d66311cc0</w:t>
       </w:r>
     </w:p>
     <w:p>
@@ -2161,7 +2161,7 @@
         <w:rPr>
           <w:rFonts w:ascii="Consolas" w:hAnsi="Consolas"/>
         </w:rPr>
-        <w:t>6ed12746631afd4991771d834e49fc5c264c8cd78dd8fa37aa4652dd22b8d28b</w:t>
+        <w:t>a3771ff5abce44db4d226e51ce63bdf38a7fb00d3cc0c15f3a923b86448ba2a3</w:t>
       </w:r>
     </w:p>
     <w:p>
@@ -2177,7 +2177,7 @@
         <w:rPr>
           <w:rFonts w:ascii="Consolas" w:hAnsi="Consolas"/>
         </w:rPr>
-        <w:t>2026-07-17T21:34:58.235555Z</w:t>
+        <w:t>2026-07-18T01:14:39.710157Z</w:t>
       </w:r>
     </w:p>
     <w:p>
@@ -2241,7 +2241,7 @@
         <w:rPr>
           <w:rFonts w:ascii="Consolas" w:hAnsi="Consolas"/>
         </w:rPr>
-        <w:t>2b161c7c94df91c227eeb64ca9a7cd068a2268a1</w:t>
+        <w:t>ed86e9aa9ab912eb94a1fe4c4f6ade0d66311cc0</w:t>
       </w:r>
     </w:p>
     <w:p>
@@ -2261,7 +2261,7 @@
         <w:br/>
         <w:t xml:space="preserve">  "PyYAML": "6.0.3",</w:t>
         <w:br/>
-        <w:t xml:space="preserve">  "nikodym": "1.2.0",</w:t>
+        <w:t xml:space="preserve">  "nikodym": "1.3.0",</w:t>
         <w:br/>
         <w:t xml:space="preserve">  "numpy": "2.4.6",</w:t>
         <w:br/>

</xml_diff>

<commit_message>
chore(demo): recaptura fixtures F4 IFRS 9 (re-skin Quarto)
</commit_message>
<xml_diff>
--- a/web/src/fixtures/demo/report-ifrs9.docx
+++ b/web/src/fixtures/demo/report-ifrs9.docx
@@ -183,7 +183,7 @@
         <w:rPr>
           <w:rFonts w:ascii="Consolas" w:hAnsi="Consolas"/>
         </w:rPr>
-        <w:t>config_hash=a3771ff5abce44db4d226e51ce63bdf38a7fb00d3cc0c15f3a923b86448ba2a3</w:t>
+        <w:t>config_hash=2fa601e1c595f2b233df26d5a07107d14fde5d4bb50aee9b68eec4dafd7c162c</w:t>
       </w:r>
     </w:p>
     <w:p>
@@ -199,7 +199,7 @@
         <w:rPr>
           <w:rFonts w:ascii="Consolas" w:hAnsi="Consolas"/>
         </w:rPr>
-        <w:t>git_sha=ed86e9aa9ab912eb94a1fe4c4f6ade0d66311cc0</w:t>
+        <w:t>git_sha=3a35f0b73e8c092b1693f10b60fb545eb4330949</w:t>
       </w:r>
     </w:p>
     <w:p>
@@ -2161,7 +2161,7 @@
         <w:rPr>
           <w:rFonts w:ascii="Consolas" w:hAnsi="Consolas"/>
         </w:rPr>
-        <w:t>a3771ff5abce44db4d226e51ce63bdf38a7fb00d3cc0c15f3a923b86448ba2a3</w:t>
+        <w:t>2fa601e1c595f2b233df26d5a07107d14fde5d4bb50aee9b68eec4dafd7c162c</w:t>
       </w:r>
     </w:p>
     <w:p>
@@ -2177,7 +2177,7 @@
         <w:rPr>
           <w:rFonts w:ascii="Consolas" w:hAnsi="Consolas"/>
         </w:rPr>
-        <w:t>2026-07-18T01:14:39.710157Z</w:t>
+        <w:t>2026-07-18T14:42:07.010995Z</w:t>
       </w:r>
     </w:p>
     <w:p>
@@ -2241,7 +2241,7 @@
         <w:rPr>
           <w:rFonts w:ascii="Consolas" w:hAnsi="Consolas"/>
         </w:rPr>
-        <w:t>ed86e9aa9ab912eb94a1fe4c4f6ade0d66311cc0</w:t>
+        <w:t>3a35f0b73e8c092b1693f10b60fb545eb4330949</w:t>
       </w:r>
     </w:p>
     <w:p>
@@ -2261,7 +2261,7 @@
         <w:br/>
         <w:t xml:space="preserve">  "PyYAML": "6.0.3",</w:t>
         <w:br/>
-        <w:t xml:space="preserve">  "nikodym": "1.3.0",</w:t>
+        <w:t xml:space="preserve">  "nikodym": "1.2.0",</w:t>
         <w:br/>
         <w:t xml:space="preserve">  "numpy": "2.4.6",</w:t>
         <w:br/>

</xml_diff>

<commit_message>
test(demo): recapturar bundle F4 con datos
</commit_message>
<xml_diff>
--- a/web/src/fixtures/demo/report-ifrs9.docx
+++ b/web/src/fixtures/demo/report-ifrs9.docx
@@ -183,7 +183,7 @@
         <w:rPr>
           <w:rFonts w:ascii="Consolas" w:hAnsi="Consolas"/>
         </w:rPr>
-        <w:t>config_hash=2fa601e1c595f2b233df26d5a07107d14fde5d4bb50aee9b68eec4dafd7c162c</w:t>
+        <w:t>config_hash=87b414024a3c8e028eeaaecae82ddef271e07dde78c2584acc2db639d9b4c7f3</w:t>
       </w:r>
     </w:p>
     <w:p>
@@ -199,7 +199,7 @@
         <w:rPr>
           <w:rFonts w:ascii="Consolas" w:hAnsi="Consolas"/>
         </w:rPr>
-        <w:t>git_sha=3a35f0b73e8c092b1693f10b60fb545eb4330949</w:t>
+        <w:t>git_sha=5b752617440ee9c5224f598c64822cd62563a2fc</w:t>
       </w:r>
     </w:p>
     <w:p>
@@ -688,6 +688,16 @@
     </w:p>
     <w:p>
       <w:r>
+        <w:t>La población procesada contiene 6.000 observaciones, 17 variables de entrada y una tasa de incumplimiento de 9.63 %. Los conteos por estado, partición y motivo de exclusión se reproducen literalmente en las tablas de esta sección.</w:t>
+      </w:r>
+    </w:p>
+    <w:p>
+      <w:r>
+        <w:t>La columna objetivo publicada por data es «target».</w:t>
+      </w:r>
+    </w:p>
+    <w:p>
+      <w:r>
         <w:t>La población se particionó por cohorte sobre «cohorte», reservando como OOT la cohorte «2024Q2», y un Holdout de 20.00 % del resto.</w:t>
       </w:r>
     </w:p>
@@ -724,6 +734,393 @@
         <w:t>Explicita la definición de incumplimiento utilizada (p. ej. 90+ días de mora) y por qué; declara las exclusiones aplicadas a la población y su justificación.</w:t>
       </w:r>
     </w:p>
+    <w:p>
+      <w:pPr>
+        <w:pStyle w:val="Heading2"/>
+      </w:pPr>
+      <w:r>
+        <w:t>2.1 Población, particiones y exclusiones</w:t>
+      </w:r>
+    </w:p>
+    <w:p>
+      <w:r>
+        <w:t>Las tablas siguientes son una proyección de presentación del DataCardSection publicado por data. Estados, tamaños y tasas por partición, y exclusiones se copian literalmente; el informe no recalcula ni completa valores ausentes.</w:t>
+      </w:r>
+    </w:p>
+    <w:p>
+      <w:r>
+        <w:rPr>
+          <w:b/>
+          <w:sz w:val="18"/>
+        </w:rPr>
+        <w:t>Estados de la población</w:t>
+      </w:r>
+    </w:p>
+    <w:tbl>
+      <w:tblPr>
+        <w:tblStyle w:val="TableGrid"/>
+        <w:tblW w:type="auto" w:w="0"/>
+        <w:tblLook w:firstColumn="1" w:firstRow="1" w:lastColumn="0" w:lastRow="0" w:noHBand="0" w:noVBand="1" w:val="04A0"/>
+      </w:tblPr>
+      <w:tblGrid>
+        <w:gridCol w:w="4320"/>
+        <w:gridCol w:w="4320"/>
+      </w:tblGrid>
+      <w:tr>
+        <w:tc>
+          <w:tcPr>
+            <w:tcW w:type="dxa" w:w="4320"/>
+          </w:tcPr>
+          <w:p>
+            <w:r>
+              <w:rPr>
+                <w:b/>
+              </w:rPr>
+              <w:t>Estado</w:t>
+            </w:r>
+          </w:p>
+        </w:tc>
+        <w:tc>
+          <w:tcPr>
+            <w:tcW w:type="dxa" w:w="4320"/>
+          </w:tcPr>
+          <w:p>
+            <w:r>
+              <w:rPr>
+                <w:b/>
+              </w:rPr>
+              <w:t>Observaciones</w:t>
+            </w:r>
+          </w:p>
+        </w:tc>
+      </w:tr>
+      <w:tr>
+        <w:tc>
+          <w:tcPr>
+            <w:tcW w:type="dxa" w:w="4320"/>
+          </w:tcPr>
+          <w:p>
+            <w:r>
+              <w:t>bueno</w:t>
+            </w:r>
+          </w:p>
+        </w:tc>
+        <w:tc>
+          <w:tcPr>
+            <w:tcW w:type="dxa" w:w="4320"/>
+          </w:tcPr>
+          <w:p>
+            <w:r>
+              <w:t>5422</w:t>
+            </w:r>
+          </w:p>
+        </w:tc>
+      </w:tr>
+      <w:tr>
+        <w:tc>
+          <w:tcPr>
+            <w:tcW w:type="dxa" w:w="4320"/>
+          </w:tcPr>
+          <w:p>
+            <w:r>
+              <w:t>malo</w:t>
+            </w:r>
+          </w:p>
+        </w:tc>
+        <w:tc>
+          <w:tcPr>
+            <w:tcW w:type="dxa" w:w="4320"/>
+          </w:tcPr>
+          <w:p>
+            <w:r>
+              <w:t>578</w:t>
+            </w:r>
+          </w:p>
+        </w:tc>
+      </w:tr>
+      <w:tr>
+        <w:tc>
+          <w:tcPr>
+            <w:tcW w:type="dxa" w:w="4320"/>
+          </w:tcPr>
+          <w:p>
+            <w:r>
+              <w:t>indeterminado</w:t>
+            </w:r>
+          </w:p>
+        </w:tc>
+        <w:tc>
+          <w:tcPr>
+            <w:tcW w:type="dxa" w:w="4320"/>
+          </w:tcPr>
+          <w:p>
+            <w:r>
+              <w:t>0</w:t>
+            </w:r>
+          </w:p>
+        </w:tc>
+      </w:tr>
+      <w:tr>
+        <w:tc>
+          <w:tcPr>
+            <w:tcW w:type="dxa" w:w="4320"/>
+          </w:tcPr>
+          <w:p>
+            <w:r>
+              <w:t>excluido</w:t>
+            </w:r>
+          </w:p>
+        </w:tc>
+        <w:tc>
+          <w:tcPr>
+            <w:tcW w:type="dxa" w:w="4320"/>
+          </w:tcPr>
+          <w:p>
+            <w:r>
+              <w:t>0</w:t>
+            </w:r>
+          </w:p>
+        </w:tc>
+      </w:tr>
+    </w:tbl>
+    <w:p>
+      <w:r>
+        <w:rPr>
+          <w:b/>
+          <w:sz w:val="18"/>
+        </w:rPr>
+        <w:t>Particiones de modelamiento</w:t>
+      </w:r>
+    </w:p>
+    <w:tbl>
+      <w:tblPr>
+        <w:tblStyle w:val="TableGrid"/>
+        <w:tblW w:type="auto" w:w="0"/>
+        <w:tblLook w:firstColumn="1" w:firstRow="1" w:lastColumn="0" w:lastRow="0" w:noHBand="0" w:noVBand="1" w:val="04A0"/>
+      </w:tblPr>
+      <w:tblGrid>
+        <w:gridCol w:w="2880"/>
+        <w:gridCol w:w="2880"/>
+        <w:gridCol w:w="2880"/>
+      </w:tblGrid>
+      <w:tr>
+        <w:tc>
+          <w:tcPr>
+            <w:tcW w:type="dxa" w:w="2880"/>
+          </w:tcPr>
+          <w:p>
+            <w:r>
+              <w:rPr>
+                <w:b/>
+              </w:rPr>
+              <w:t>Partición</w:t>
+            </w:r>
+          </w:p>
+        </w:tc>
+        <w:tc>
+          <w:tcPr>
+            <w:tcW w:type="dxa" w:w="2880"/>
+          </w:tcPr>
+          <w:p>
+            <w:r>
+              <w:rPr>
+                <w:b/>
+              </w:rPr>
+              <w:t>Observaciones</w:t>
+            </w:r>
+          </w:p>
+        </w:tc>
+        <w:tc>
+          <w:tcPr>
+            <w:tcW w:type="dxa" w:w="2880"/>
+          </w:tcPr>
+          <w:p>
+            <w:r>
+              <w:rPr>
+                <w:b/>
+              </w:rPr>
+              <w:t>Tasa de incumplimiento</w:t>
+            </w:r>
+          </w:p>
+        </w:tc>
+      </w:tr>
+      <w:tr>
+        <w:tc>
+          <w:tcPr>
+            <w:tcW w:type="dxa" w:w="2880"/>
+          </w:tcPr>
+          <w:p>
+            <w:r>
+              <w:t>desarrollo</w:t>
+            </w:r>
+          </w:p>
+        </w:tc>
+        <w:tc>
+          <w:tcPr>
+            <w:tcW w:type="dxa" w:w="2880"/>
+          </w:tcPr>
+          <w:p>
+            <w:r>
+              <w:t>4024</w:t>
+            </w:r>
+          </w:p>
+        </w:tc>
+        <w:tc>
+          <w:tcPr>
+            <w:tcW w:type="dxa" w:w="2880"/>
+          </w:tcPr>
+          <w:p>
+            <w:r>
+              <w:t>0.0964</w:t>
+            </w:r>
+          </w:p>
+        </w:tc>
+      </w:tr>
+      <w:tr>
+        <w:tc>
+          <w:tcPr>
+            <w:tcW w:type="dxa" w:w="2880"/>
+          </w:tcPr>
+          <w:p>
+            <w:r>
+              <w:t>holdout</w:t>
+            </w:r>
+          </w:p>
+        </w:tc>
+        <w:tc>
+          <w:tcPr>
+            <w:tcW w:type="dxa" w:w="2880"/>
+          </w:tcPr>
+          <w:p>
+            <w:r>
+              <w:t>1030</w:t>
+            </w:r>
+          </w:p>
+        </w:tc>
+        <w:tc>
+          <w:tcPr>
+            <w:tcW w:type="dxa" w:w="2880"/>
+          </w:tcPr>
+          <w:p>
+            <w:r>
+              <w:t>0.1000</w:t>
+            </w:r>
+          </w:p>
+        </w:tc>
+      </w:tr>
+      <w:tr>
+        <w:tc>
+          <w:tcPr>
+            <w:tcW w:type="dxa" w:w="2880"/>
+          </w:tcPr>
+          <w:p>
+            <w:r>
+              <w:t>oot</w:t>
+            </w:r>
+          </w:p>
+        </w:tc>
+        <w:tc>
+          <w:tcPr>
+            <w:tcW w:type="dxa" w:w="2880"/>
+          </w:tcPr>
+          <w:p>
+            <w:r>
+              <w:t>946</w:t>
+            </w:r>
+          </w:p>
+        </w:tc>
+        <w:tc>
+          <w:tcPr>
+            <w:tcW w:type="dxa" w:w="2880"/>
+          </w:tcPr>
+          <w:p>
+            <w:r>
+              <w:t>0.0920</w:t>
+            </w:r>
+          </w:p>
+        </w:tc>
+      </w:tr>
+      <w:tr>
+        <w:tc>
+          <w:tcPr>
+            <w:tcW w:type="dxa" w:w="2880"/>
+          </w:tcPr>
+          <w:p>
+            <w:r>
+              <w:t>fuera_de_modelo</w:t>
+            </w:r>
+          </w:p>
+        </w:tc>
+        <w:tc>
+          <w:tcPr>
+            <w:tcW w:type="dxa" w:w="2880"/>
+          </w:tcPr>
+          <w:p>
+            <w:r>
+              <w:t>0</w:t>
+            </w:r>
+          </w:p>
+        </w:tc>
+        <w:tc>
+          <w:tcPr>
+            <w:tcW w:type="dxa" w:w="2880"/>
+          </w:tcPr>
+          <w:p>
+            <w:r>
+              <w:t>0.0000</w:t>
+            </w:r>
+          </w:p>
+        </w:tc>
+      </w:tr>
+    </w:tbl>
+    <w:p>
+      <w:r>
+        <w:rPr>
+          <w:b/>
+          <w:sz w:val="18"/>
+        </w:rPr>
+        <w:t>Exclusiones aplicadas</w:t>
+      </w:r>
+    </w:p>
+    <w:tbl>
+      <w:tblPr>
+        <w:tblStyle w:val="TableGrid"/>
+        <w:tblW w:type="auto" w:w="0"/>
+        <w:tblLook w:firstColumn="1" w:firstRow="1" w:lastColumn="0" w:lastRow="0" w:noHBand="0" w:noVBand="1" w:val="04A0"/>
+      </w:tblPr>
+      <w:tblGrid>
+        <w:gridCol w:w="4320"/>
+        <w:gridCol w:w="4320"/>
+      </w:tblGrid>
+      <w:tr>
+        <w:tc>
+          <w:tcPr>
+            <w:tcW w:type="dxa" w:w="4320"/>
+          </w:tcPr>
+          <w:p>
+            <w:r>
+              <w:rPr>
+                <w:b/>
+              </w:rPr>
+              <w:t>Motivo</w:t>
+            </w:r>
+          </w:p>
+        </w:tc>
+        <w:tc>
+          <w:tcPr>
+            <w:tcW w:type="dxa" w:w="4320"/>
+          </w:tcPr>
+          <w:p>
+            <w:r>
+              <w:rPr>
+                <w:b/>
+              </w:rPr>
+              <w:t>Exclusiones</w:t>
+            </w:r>
+          </w:p>
+        </w:tc>
+      </w:tr>
+    </w:tbl>
     <w:p>
       <w:pPr>
         <w:pStyle w:val="Heading1"/>
@@ -2114,7 +2511,7 @@
     </w:p>
     <w:p>
       <w:r>
-        <w:t>El alcance de este informe es el cálculo de la pérdida crediticia esperada IFRS 9 (capítulo «Provisiones IFRS 9 / ECL»), una función experimental (SDD-16 en borrador) fuera de la garantía SemVer 1.x. La curva PD lifetime se ajustó en esta misma corrida de forma autocontenida sobre la historia de la propia cartera, sin insumos de un scorecard de originación; su validación completa como modelo —discriminación, calibración y estabilidad— no forma parte de esta corrida. El backtesting de la ECL corresponde a fases posteriores y no se cubre ni se infiere aquí.</w:t>
+        <w:t>El alcance de este informe es el cálculo de la pérdida crediticia esperada IFRS 9 (capítulo «Provisiones IFRS 9 / ECL»), una función experimental (SDD-16 en borrador) fuera de la garantía SemVer 1.x. La curva PD lifetime se ajustó en esta misma corrida de forma autocontenida sobre la historia de la propia cartera, sin insumos de un scorecard de originación. Esta corrida no ejecutó la capa de validación formal; el informe no infiere sus resultados. El backtesting de la ECL no se ejecutó ni se infiere aquí.</w:t>
       </w:r>
     </w:p>
     <w:p>
@@ -2161,7 +2558,7 @@
         <w:rPr>
           <w:rFonts w:ascii="Consolas" w:hAnsi="Consolas"/>
         </w:rPr>
-        <w:t>2fa601e1c595f2b233df26d5a07107d14fde5d4bb50aee9b68eec4dafd7c162c</w:t>
+        <w:t>87b414024a3c8e028eeaaecae82ddef271e07dde78c2584acc2db639d9b4c7f3</w:t>
       </w:r>
     </w:p>
     <w:p>
@@ -2177,7 +2574,7 @@
         <w:rPr>
           <w:rFonts w:ascii="Consolas" w:hAnsi="Consolas"/>
         </w:rPr>
-        <w:t>2026-07-18T14:42:07.010995Z</w:t>
+        <w:t>2026-07-18T17:32:33.411422Z</w:t>
       </w:r>
     </w:p>
     <w:p>
@@ -2241,7 +2638,7 @@
         <w:rPr>
           <w:rFonts w:ascii="Consolas" w:hAnsi="Consolas"/>
         </w:rPr>
-        <w:t>3a35f0b73e8c092b1693f10b60fb545eb4330949</w:t>
+        <w:t>5b752617440ee9c5224f598c64822cd62563a2fc</w:t>
       </w:r>
     </w:p>
     <w:p>
@@ -2261,7 +2658,7 @@
         <w:br/>
         <w:t xml:space="preserve">  "PyYAML": "6.0.3",</w:t>
         <w:br/>
-        <w:t xml:space="preserve">  "nikodym": "1.2.0",</w:t>
+        <w:t xml:space="preserve">  "nikodym": "1.3.0",</w:t>
         <w:br/>
         <w:t xml:space="preserve">  "numpy": "2.4.6",</w:t>
         <w:br/>
@@ -2372,7 +2769,13 @@
         </w:rPr>
         <w:t>[</w:t>
         <w:br/>
-        <w:t xml:space="preserve">  "provisioning_ifrs9.summary"</w:t>
+        <w:t xml:space="preserve">  "provisioning_ifrs9.summary",</w:t>
+        <w:br/>
+        <w:t xml:space="preserve">  "data.states",</w:t>
+        <w:br/>
+        <w:t xml:space="preserve">  "data.partitions",</w:t>
+        <w:br/>
+        <w:t xml:space="preserve">  "data.exclusions"</w:t>
         <w:br/>
         <w:t>]</w:t>
       </w:r>
@@ -2395,7 +2798,535 @@
         <w:pStyle w:val="Heading2"/>
       </w:pPr>
       <w:r>
-        <w:t>C.1 Supervivencia y curva PD lifetime</w:t>
+        <w:t>C.1 Población, particiones y exclusiones</w:t>
+      </w:r>
+    </w:p>
+    <w:p>
+      <w:r>
+        <w:rPr>
+          <w:rFonts w:ascii="Consolas" w:hAnsi="Consolas"/>
+        </w:rPr>
+        <w:t>Artefacto de origen: data.data_card</w:t>
+      </w:r>
+    </w:p>
+    <w:p>
+      <w:pPr>
+        <w:pStyle w:val="Heading3"/>
+      </w:pPr>
+      <w:r>
+        <w:t>Parámetros y payload</w:t>
+      </w:r>
+    </w:p>
+    <w:p>
+      <w:r>
+        <w:rPr>
+          <w:b/>
+        </w:rPr>
+        <w:t>bad_rate</w:t>
+      </w:r>
+    </w:p>
+    <w:p>
+      <w:r>
+        <w:rPr>
+          <w:rFonts w:ascii="Consolas" w:hAnsi="Consolas"/>
+        </w:rPr>
+        <w:t>0.0963</w:t>
+      </w:r>
+    </w:p>
+    <w:p>
+      <w:r>
+        <w:rPr>
+          <w:b/>
+        </w:rPr>
+        <w:t>class_counts</w:t>
+      </w:r>
+    </w:p>
+    <w:p>
+      <w:r>
+        <w:rPr>
+          <w:rFonts w:ascii="Consolas" w:hAnsi="Consolas"/>
+        </w:rPr>
+        <w:t>{</w:t>
+        <w:br/>
+        <w:t xml:space="preserve">  "bueno": 5422,</w:t>
+        <w:br/>
+        <w:t xml:space="preserve">  "excluido": 0,</w:t>
+        <w:br/>
+        <w:t xml:space="preserve">  "indeterminado": 0,</w:t>
+        <w:br/>
+        <w:t xml:space="preserve">  "malo": 578</w:t>
+        <w:br/>
+        <w:t>}</w:t>
+      </w:r>
+    </w:p>
+    <w:p>
+      <w:r>
+        <w:rPr>
+          <w:b/>
+        </w:rPr>
+        <w:t>data_hash</w:t>
+      </w:r>
+    </w:p>
+    <w:p>
+      <w:r>
+        <w:rPr>
+          <w:rFonts w:ascii="Consolas" w:hAnsi="Consolas"/>
+        </w:rPr>
+        <w:t>d713808d0604110d6c450358453cea172934d93eb56ccdcb0e7aea7279a94e3e</w:t>
+      </w:r>
+    </w:p>
+    <w:p>
+      <w:r>
+        <w:rPr>
+          <w:b/>
+        </w:rPr>
+        <w:t>effective_config</w:t>
+      </w:r>
+    </w:p>
+    <w:p>
+      <w:r>
+        <w:rPr>
+          <w:rFonts w:ascii="Consolas" w:hAnsi="Consolas"/>
+        </w:rPr>
+        <w:t>{</w:t>
+        <w:br/>
+        <w:t xml:space="preserve">  "load": {</w:t>
+        <w:br/>
+        <w:t xml:space="preserve">    "backend": "pandas",</w:t>
+        <w:br/>
+        <w:t xml:space="preserve">    "csv_options": {</w:t>
+        <w:br/>
+        <w:t xml:space="preserve">      "decimal": ".",</w:t>
+        <w:br/>
+        <w:t xml:space="preserve">      "encoding": "utf-8",</w:t>
+        <w:br/>
+        <w:t xml:space="preserve">      "sep": ","</w:t>
+        <w:br/>
+        <w:t xml:space="preserve">    },</w:t>
+        <w:br/>
+        <w:t xml:space="preserve">    "file_format": "auto",</w:t>
+        <w:br/>
+        <w:t xml:space="preserve">    "source": "/private/var/folders/12/yxnq95f55hg06fyynglz1scw0000gn/T/tmp0ezh_iui/datasets/ifrs9_retail_latam.parquet"</w:t>
+        <w:br/>
+        <w:t xml:space="preserve">  },</w:t>
+        <w:br/>
+        <w:t xml:space="preserve">  "missing": {</w:t>
+        <w:br/>
+        <w:t xml:space="preserve">    "max_missing_rate": "0.9900",</w:t>
+        <w:br/>
+        <w:t xml:space="preserve">    "special_values": []</w:t>
+        <w:br/>
+        <w:t xml:space="preserve">  },</w:t>
+        <w:br/>
+        <w:t xml:space="preserve">  "partition": {</w:t>
+        <w:br/>
+        <w:t xml:space="preserve">    "min_bads_per_partition": 30,</w:t>
+        <w:br/>
+        <w:t xml:space="preserve">    "strategy": {</w:t>
+        <w:br/>
+        <w:t xml:space="preserve">      "cohort_col": "cohorte",</w:t>
+        <w:br/>
+        <w:t xml:space="preserve">      "holdout_fraction": "0.2000",</w:t>
+        <w:br/>
+        <w:t xml:space="preserve">      "oot_cohorts": [</w:t>
+        <w:br/>
+        <w:t xml:space="preserve">        "2024Q2"</w:t>
+        <w:br/>
+        <w:t xml:space="preserve">      ],</w:t>
+        <w:br/>
+        <w:t xml:space="preserve">      "type": "cohort"</w:t>
+        <w:br/>
+        <w:t xml:space="preserve">    },</w:t>
+        <w:br/>
+        <w:t xml:space="preserve">    "ttd_includes_excluded": true</w:t>
+        <w:br/>
+        <w:t xml:space="preserve">  },</w:t>
+        <w:br/>
+        <w:t xml:space="preserve">  "schema_": {</w:t>
+        <w:br/>
+        <w:t xml:space="preserve">    "columns": [</w:t>
+        <w:br/>
+        <w:t xml:space="preserve">      {</w:t>
+        <w:br/>
+        <w:t xml:space="preserve">        "coerce": false,</w:t>
+        <w:br/>
+        <w:t xml:space="preserve">        "dtype": "float",</w:t>
+        <w:br/>
+        <w:t xml:space="preserve">        "ge": null,</w:t>
+        <w:br/>
+        <w:t xml:space="preserve">        "isin": null,</w:t>
+        <w:br/>
+        <w:t xml:space="preserve">        "le": null,</w:t>
+        <w:br/>
+        <w:t xml:space="preserve">        "name": "ingreso_mensual",</w:t>
+        <w:br/>
+        <w:t xml:space="preserve">        "nullable": false,</w:t>
+        <w:br/>
+        <w:t xml:space="preserve">        "required": true,</w:t>
+        <w:br/>
+        <w:t xml:space="preserve">        "unique": false</w:t>
+        <w:br/>
+        <w:t xml:space="preserve">      },</w:t>
+        <w:br/>
+        <w:t xml:space="preserve">      {</w:t>
+        <w:br/>
+        <w:t xml:space="preserve">        "coerce": false,</w:t>
+        <w:br/>
+        <w:t xml:space="preserve">        "dtype": "float",</w:t>
+        <w:br/>
+        <w:t xml:space="preserve">        "ge": null,</w:t>
+        <w:br/>
+        <w:t xml:space="preserve">        "isin": null,</w:t>
+        <w:br/>
+        <w:t xml:space="preserve">        "le": null,</w:t>
+        <w:br/>
+        <w:t xml:space="preserve">        "name": "deuda_ingreso",</w:t>
+        <w:br/>
+        <w:t xml:space="preserve">        "nullable": false,</w:t>
+        <w:br/>
+        <w:t xml:space="preserve">        "required": true,</w:t>
+        <w:br/>
+        <w:t xml:space="preserve">        "unique": false</w:t>
+        <w:br/>
+        <w:t xml:space="preserve">      },</w:t>
+        <w:br/>
+        <w:t xml:space="preserve">      {</w:t>
+        <w:br/>
+        <w:t xml:space="preserve">        "coerce": false,</w:t>
+        <w:br/>
+        <w:t xml:space="preserve">        "dtype": "float",</w:t>
+        <w:br/>
+        <w:t xml:space="preserve">        "ge": null,</w:t>
+        <w:br/>
+        <w:t xml:space="preserve">        "isin": null,</w:t>
+        <w:br/>
+        <w:t xml:space="preserve">        "le": null,</w:t>
+        <w:br/>
+        <w:t xml:space="preserve">        "name": "utilizacion_linea",</w:t>
+        <w:br/>
+        <w:t xml:space="preserve">        "nullable": false,</w:t>
+        <w:br/>
+        <w:t xml:space="preserve">        "required": true,</w:t>
+        <w:br/>
+        <w:t xml:space="preserve">        "unique": false</w:t>
+        <w:br/>
+        <w:t xml:space="preserve">      },</w:t>
+        <w:br/>
+        <w:t xml:space="preserve">      {</w:t>
+        <w:br/>
+        <w:t xml:space="preserve">        "coerce": false,</w:t>
+        <w:br/>
+        <w:t xml:space="preserve">        "dtype": "int",</w:t>
+        <w:br/>
+        <w:t xml:space="preserve">        "ge": null,</w:t>
+        <w:br/>
+        <w:t xml:space="preserve">        "isin": null,</w:t>
+        <w:br/>
+        <w:t xml:space="preserve">        "le": null,</w:t>
+        <w:br/>
+        <w:t xml:space="preserve">        "name": "mora_max_12m",</w:t>
+        <w:br/>
+        <w:t xml:space="preserve">        "nullable": false,</w:t>
+        <w:br/>
+        <w:t xml:space="preserve">        "required": true,</w:t>
+        <w:br/>
+        <w:t xml:space="preserve">        "unique": false</w:t>
+        <w:br/>
+        <w:t xml:space="preserve">      },</w:t>
+        <w:br/>
+        <w:t xml:space="preserve">      {</w:t>
+        <w:br/>
+        <w:t xml:space="preserve">        "coerce": false,</w:t>
+        <w:br/>
+        <w:t xml:space="preserve">        "dtype": "int",</w:t>
+        <w:br/>
+        <w:t xml:space="preserve">        "ge": null,</w:t>
+        <w:br/>
+        <w:t xml:space="preserve">        "isin": null,</w:t>
+        <w:br/>
+        <w:t xml:space="preserve">        "le": null,</w:t>
+        <w:br/>
+        <w:t xml:space="preserve">        "name": "antiguedad_meses",</w:t>
+        <w:br/>
+        <w:t xml:space="preserve">        "nullable": false,</w:t>
+        <w:br/>
+        <w:t xml:space="preserve">        "required": true,</w:t>
+        <w:br/>
+        <w:t xml:space="preserve">        "unique": false</w:t>
+        <w:br/>
+        <w:t xml:space="preserve">      },</w:t>
+        <w:br/>
+        <w:t xml:space="preserve">      {</w:t>
+        <w:br/>
+        <w:t xml:space="preserve">        "coerce": false,</w:t>
+        <w:br/>
+        <w:t xml:space="preserve">        "dtype": "str",</w:t>
+        <w:br/>
+        <w:t xml:space="preserve">        "ge": null,</w:t>
+        <w:br/>
+        <w:t xml:space="preserve">        "isin": null,</w:t>
+        <w:br/>
+        <w:t xml:space="preserve">        "le": null,</w:t>
+        <w:br/>
+        <w:t xml:space="preserve">        "name": "segmento",</w:t>
+        <w:br/>
+        <w:t xml:space="preserve">        "nullable": false,</w:t>
+        <w:br/>
+        <w:t xml:space="preserve">        "required": true,</w:t>
+        <w:br/>
+        <w:t xml:space="preserve">        "unique": false</w:t>
+        <w:br/>
+        <w:t xml:space="preserve">      },</w:t>
+        <w:br/>
+        <w:t xml:space="preserve">      {</w:t>
+        <w:br/>
+        <w:t xml:space="preserve">        "coerce": false,</w:t>
+        <w:br/>
+        <w:t xml:space="preserve">        "dtype": "str",</w:t>
+        <w:br/>
+        <w:t xml:space="preserve">        "ge": null,</w:t>
+        <w:br/>
+        <w:t xml:space="preserve">        "isin": null,</w:t>
+        <w:br/>
+        <w:t xml:space="preserve">        "le": null,</w:t>
+        <w:br/>
+        <w:t xml:space="preserve">        "name": "cohorte",</w:t>
+        <w:br/>
+        <w:t xml:space="preserve">        "nullable": false,</w:t>
+        <w:br/>
+        <w:t xml:space="preserve">        "required": true,</w:t>
+        <w:br/>
+        <w:t xml:space="preserve">        "unique": false</w:t>
+        <w:br/>
+        <w:t xml:space="preserve">      },</w:t>
+        <w:br/>
+        <w:t xml:space="preserve">      {</w:t>
+        <w:br/>
+        <w:t xml:space="preserve">        "coerce": false,</w:t>
+        <w:br/>
+        <w:t xml:space="preserve">        "dtype": "int",</w:t>
+        <w:br/>
+        <w:t xml:space="preserve">        "ge": null,</w:t>
+        <w:br/>
+        <w:t xml:space="preserve">        "isin": null,</w:t>
+        <w:br/>
+        <w:t xml:space="preserve">        "le": null,</w:t>
+        <w:br/>
+        <w:t xml:space="preserve">        "name": "bad_flag",</w:t>
+        <w:br/>
+        <w:t xml:space="preserve">        "nullable": false,</w:t>
+        <w:br/>
+        <w:t xml:space="preserve">        "required": true,</w:t>
+        <w:br/>
+        <w:t xml:space="preserve">        "unique": false</w:t>
+        <w:br/>
+        <w:t xml:space="preserve">      }</w:t>
+        <w:br/>
+        <w:t xml:space="preserve">    ],</w:t>
+        <w:br/>
+        <w:t xml:space="preserve">    "index_col": "loan_id",</w:t>
+        <w:br/>
+        <w:t xml:space="preserve">    "ordered": false,</w:t>
+        <w:br/>
+        <w:t xml:space="preserve">    "strict": false,</w:t>
+        <w:br/>
+        <w:t xml:space="preserve">    "unique_keys": null</w:t>
+        <w:br/>
+        <w:t xml:space="preserve">  },</w:t>
+        <w:br/>
+        <w:t xml:space="preserve">  "target": {</w:t>
+        <w:br/>
+        <w:t xml:space="preserve">    "bad_rule": {</w:t>
+        <w:br/>
+        <w:t xml:space="preserve">      "all_of": [</w:t>
+        <w:br/>
+        <w:t xml:space="preserve">        {</w:t>
+        <w:br/>
+        <w:t xml:space="preserve">          "col": "bad_flag",</w:t>
+        <w:br/>
+        <w:t xml:space="preserve">          "op": "==",</w:t>
+        <w:br/>
+        <w:t xml:space="preserve">          "value": 1</w:t>
+        <w:br/>
+        <w:t xml:space="preserve">        }</w:t>
+        <w:br/>
+        <w:t xml:space="preserve">      ],</w:t>
+        <w:br/>
+        <w:t xml:space="preserve">      "any_of": []</w:t>
+        <w:br/>
+        <w:t xml:space="preserve">    },</w:t>
+        <w:br/>
+        <w:t xml:space="preserve">    "exclusion_rules": [],</w:t>
+        <w:br/>
+        <w:t xml:space="preserve">    "good_rule": null,</w:t>
+        <w:br/>
+        <w:t xml:space="preserve">    "indeterminate_rule": null,</w:t>
+        <w:br/>
+        <w:t xml:space="preserve">    "target_col": "target",</w:t>
+        <w:br/>
+        <w:t xml:space="preserve">    "window": null</w:t>
+        <w:br/>
+        <w:t xml:space="preserve">  },</w:t>
+        <w:br/>
+        <w:t xml:space="preserve">  "type": "standard"</w:t>
+        <w:br/>
+        <w:t>}</w:t>
+      </w:r>
+    </w:p>
+    <w:p>
+      <w:r>
+        <w:rPr>
+          <w:b/>
+        </w:rPr>
+        <w:t>exclusions_by_reason</w:t>
+      </w:r>
+    </w:p>
+    <w:p>
+      <w:r>
+        <w:rPr>
+          <w:rFonts w:ascii="Consolas" w:hAnsi="Consolas"/>
+        </w:rPr>
+        <w:t>{}</w:t>
+      </w:r>
+    </w:p>
+    <w:p>
+      <w:r>
+        <w:rPr>
+          <w:b/>
+        </w:rPr>
+        <w:t>n_features</w:t>
+      </w:r>
+    </w:p>
+    <w:p>
+      <w:r>
+        <w:rPr>
+          <w:rFonts w:ascii="Consolas" w:hAnsi="Consolas"/>
+        </w:rPr>
+        <w:t>17</w:t>
+      </w:r>
+    </w:p>
+    <w:p>
+      <w:r>
+        <w:rPr>
+          <w:b/>
+        </w:rPr>
+        <w:t>n_rows</w:t>
+      </w:r>
+    </w:p>
+    <w:p>
+      <w:r>
+        <w:rPr>
+          <w:rFonts w:ascii="Consolas" w:hAnsi="Consolas"/>
+        </w:rPr>
+        <w:t>6000</w:t>
+      </w:r>
+    </w:p>
+    <w:p>
+      <w:r>
+        <w:rPr>
+          <w:b/>
+        </w:rPr>
+        <w:t>partition_bad_rates</w:t>
+      </w:r>
+    </w:p>
+    <w:p>
+      <w:r>
+        <w:rPr>
+          <w:rFonts w:ascii="Consolas" w:hAnsi="Consolas"/>
+        </w:rPr>
+        <w:t>{</w:t>
+        <w:br/>
+        <w:t xml:space="preserve">  "desarrollo": "0.0964",</w:t>
+        <w:br/>
+        <w:t xml:space="preserve">  "fuera_de_modelo": "0.0000",</w:t>
+        <w:br/>
+        <w:t xml:space="preserve">  "holdout": "0.1000",</w:t>
+        <w:br/>
+        <w:t xml:space="preserve">  "oot": "0.0920"</w:t>
+        <w:br/>
+        <w:t>}</w:t>
+      </w:r>
+    </w:p>
+    <w:p>
+      <w:r>
+        <w:rPr>
+          <w:b/>
+        </w:rPr>
+        <w:t>partition_sizes</w:t>
+      </w:r>
+    </w:p>
+    <w:p>
+      <w:r>
+        <w:rPr>
+          <w:rFonts w:ascii="Consolas" w:hAnsi="Consolas"/>
+        </w:rPr>
+        <w:t>{</w:t>
+        <w:br/>
+        <w:t xml:space="preserve">  "desarrollo": 4024,</w:t>
+        <w:br/>
+        <w:t xml:space="preserve">  "fuera_de_modelo": 0,</w:t>
+        <w:br/>
+        <w:t xml:space="preserve">  "holdout": 1030,</w:t>
+        <w:br/>
+        <w:t xml:space="preserve">  "oot": 946</w:t>
+        <w:br/>
+        <w:t>}</w:t>
+      </w:r>
+    </w:p>
+    <w:p>
+      <w:r>
+        <w:rPr>
+          <w:b/>
+        </w:rPr>
+        <w:t>performance_window_months</w:t>
+      </w:r>
+    </w:p>
+    <w:p>
+      <w:r>
+        <w:rPr>
+          <w:rFonts w:ascii="Consolas" w:hAnsi="Consolas"/>
+        </w:rPr>
+        <w:t>No disponible</w:t>
+      </w:r>
+    </w:p>
+    <w:p>
+      <w:r>
+        <w:rPr>
+          <w:b/>
+        </w:rPr>
+        <w:t>source</w:t>
+      </w:r>
+    </w:p>
+    <w:p>
+      <w:r>
+        <w:rPr>
+          <w:rFonts w:ascii="Consolas" w:hAnsi="Consolas"/>
+        </w:rPr>
+        <w:t>ifrs9_retail_latam.parquet</w:t>
+      </w:r>
+    </w:p>
+    <w:p>
+      <w:r>
+        <w:rPr>
+          <w:b/>
+        </w:rPr>
+        <w:t>target_col</w:t>
+      </w:r>
+    </w:p>
+    <w:p>
+      <w:r>
+        <w:rPr>
+          <w:rFonts w:ascii="Consolas" w:hAnsi="Consolas"/>
+        </w:rPr>
+        <w:t>target</w:t>
+      </w:r>
+    </w:p>
+    <w:p>
+      <w:pPr>
+        <w:pStyle w:val="Heading2"/>
+      </w:pPr>
+      <w:r>
+        <w:t>C.2 Supervivencia y curva PD lifetime</w:t>
       </w:r>
     </w:p>
     <w:p>
@@ -2959,7 +3890,7 @@
         <w:pStyle w:val="Heading2"/>
       </w:pPr>
       <w:r>
-        <w:t>C.2 Pérdida crediticia esperada (ECL) por etapas</w:t>
+        <w:t>C.3 Pérdida crediticia esperada (ECL) por etapas</w:t>
       </w:r>
     </w:p>
     <w:p>

</xml_diff>

<commit_message>
chore(demo): recapturar F4 sin ruta del host en el config efectivo
Recaptura del bundle F4/IFRS 9 con el workdir canónico (.nikodym-demo-fixtures-f4):
el 'config efectivo' del informe (Anexo A, data.load.source) pasa de una ruta
temporal del host (/private/var/folders/.../T/tmp.../datasets/ifrs9_retail_latam.parquet)
al identificador POSIX portable .nikodym-demo-fixtures-f4/datasets/ifrs9_retail_latam.parquet
en HTML, PDF, DOCX y el zip. Números de negocio idénticos: results-ifrs9.json solo
cambia run_id; el informe solo cambia created_at/config_hash/git_sha/ruta. Insignia
IFRS 9 intacta (ECL 3.423.116 · EAD 114.325.315 · cobertura 2,99 % · stages 5235/477/288).
</commit_message>
<xml_diff>
--- a/web/src/fixtures/demo/report-ifrs9.docx
+++ b/web/src/fixtures/demo/report-ifrs9.docx
@@ -163,7 +163,7 @@
           </w:tcPr>
           <w:p>
             <w:r>
-              <w:t>2026-07-18</w:t>
+              <w:t>2026-07-20</w:t>
             </w:r>
           </w:p>
         </w:tc>
@@ -183,7 +183,7 @@
         <w:rPr>
           <w:rFonts w:ascii="Consolas" w:hAnsi="Consolas"/>
         </w:rPr>
-        <w:t>config_hash=87b414024a3c8e028eeaaecae82ddef271e07dde78c2584acc2db639d9b4c7f3</w:t>
+        <w:t>config_hash=1865026045421cb43e4479a36335f7261ee0a0ea86cf40b7f87d654d16b81df6</w:t>
       </w:r>
     </w:p>
     <w:p>
@@ -199,7 +199,7 @@
         <w:rPr>
           <w:rFonts w:ascii="Consolas" w:hAnsi="Consolas"/>
         </w:rPr>
-        <w:t>git_sha=5b752617440ee9c5224f598c64822cd62563a2fc</w:t>
+        <w:t>git_sha=741a4031228596b874a291cc5dd490e6f34a8c39</w:t>
       </w:r>
     </w:p>
     <w:p>
@@ -2558,7 +2558,7 @@
         <w:rPr>
           <w:rFonts w:ascii="Consolas" w:hAnsi="Consolas"/>
         </w:rPr>
-        <w:t>87b414024a3c8e028eeaaecae82ddef271e07dde78c2584acc2db639d9b4c7f3</w:t>
+        <w:t>1865026045421cb43e4479a36335f7261ee0a0ea86cf40b7f87d654d16b81df6</w:t>
       </w:r>
     </w:p>
     <w:p>
@@ -2574,7 +2574,7 @@
         <w:rPr>
           <w:rFonts w:ascii="Consolas" w:hAnsi="Consolas"/>
         </w:rPr>
-        <w:t>2026-07-18T17:32:33.411422Z</w:t>
+        <w:t>2026-07-20T18:38:12.216233Z</w:t>
       </w:r>
     </w:p>
     <w:p>
@@ -2638,7 +2638,7 @@
         <w:rPr>
           <w:rFonts w:ascii="Consolas" w:hAnsi="Consolas"/>
         </w:rPr>
-        <w:t>5b752617440ee9c5224f598c64822cd62563a2fc</w:t>
+        <w:t>741a4031228596b874a291cc5dd490e6f34a8c39</w:t>
       </w:r>
     </w:p>
     <w:p>
@@ -2906,7 +2906,7 @@
         <w:br/>
         <w:t xml:space="preserve">    "file_format": "auto",</w:t>
         <w:br/>
-        <w:t xml:space="preserve">    "source": "/private/var/folders/12/yxnq95f55hg06fyynglz1scw0000gn/T/tmp0ezh_iui/datasets/ifrs9_retail_latam.parquet"</w:t>
+        <w:t xml:space="preserve">    "source": ".nikodym-demo-fixtures-f4/datasets/ifrs9_retail_latam.parquet"</w:t>
         <w:br/>
         <w:t xml:space="preserve">  },</w:t>
         <w:br/>

</xml_diff>

<commit_message>
chore(demo): recapturar el bundle F4 (IFRS 9) desde corrida real 1.4.0
Verificado sobre el artefacto: lineage 1.4.0, coma decimal en la prosa
(«cobertura del 2,99 %»), 0 celdas `nan`/`none`, 0 rutas del host,
`toyaml-ifrs9.json` sin `report.document` y `config_hash` app ≡ informe
(cbe5d9fa…). Insignias invariantes: EAD $114.325.315 · ECL $3.423.116 ·
cobertura 2,99 % · S1 5.235 / S2 477 / S3 288.

Único cambio del YAML: cae `provisioning_internal: null` (efecto de
`exclude_unset=True`, igual que en F1).
</commit_message>
<xml_diff>
--- a/web/src/fixtures/demo/report-ifrs9.docx
+++ b/web/src/fixtures/demo/report-ifrs9.docx
@@ -163,7 +163,7 @@
           </w:tcPr>
           <w:p>
             <w:r>
-              <w:t>2026-07-20</w:t>
+              <w:t>2026-07-21</w:t>
             </w:r>
           </w:p>
         </w:tc>
@@ -183,7 +183,7 @@
         <w:rPr>
           <w:rFonts w:ascii="Consolas" w:hAnsi="Consolas"/>
         </w:rPr>
-        <w:t>config_hash=1865026045421cb43e4479a36335f7261ee0a0ea86cf40b7f87d654d16b81df6</w:t>
+        <w:t>config_hash=cbe5d9fa856ae838623e88974bf1ea783825289ff8580c9b02098a0392c8f4d4</w:t>
       </w:r>
     </w:p>
     <w:p>
@@ -199,7 +199,7 @@
         <w:rPr>
           <w:rFonts w:ascii="Consolas" w:hAnsi="Consolas"/>
         </w:rPr>
-        <w:t>git_sha=741a4031228596b874a291cc5dd490e6f34a8c39</w:t>
+        <w:t>git_sha=91921e7fd5df1f9ba2f0379542198681e902c80c</w:t>
       </w:r>
     </w:p>
     <w:p>
@@ -571,7 +571,7 @@
           </w:tcPr>
           <w:p>
             <w:r>
-              <w:t>2.99 %</w:t>
+              <w:t>2,99 %</w:t>
             </w:r>
           </w:p>
         </w:tc>
@@ -688,7 +688,7 @@
     </w:p>
     <w:p>
       <w:r>
-        <w:t>La población procesada contiene 6.000 observaciones, 17 variables de entrada y una tasa de incumplimiento de 9.63 %. Los conteos por estado, partición y motivo de exclusión se reproducen literalmente en las tablas de esta sección.</w:t>
+        <w:t>La población procesada contiene 6.000 observaciones, 17 variables de entrada y una tasa de incumplimiento de 9,63 %. Los conteos por estado, partición y motivo de exclusión se reproducen literalmente en las tablas de esta sección.</w:t>
       </w:r>
     </w:p>
     <w:p>
@@ -698,7 +698,7 @@
     </w:p>
     <w:p>
       <w:r>
-        <w:t>La población se particionó por cohorte sobre «cohorte», reservando como OOT la cohorte «2024Q2», y un Holdout de 20.00 % del resto.</w:t>
+        <w:t>La población se particionó por cohorte sobre «cohorte», reservando como OOT la cohorte «2024Q2», y un Holdout de 20,00 % del resto.</w:t>
       </w:r>
     </w:p>
     <w:p>
@@ -1149,7 +1149,7 @@
     </w:p>
     <w:p>
       <w:r>
-        <w:t>En el tratamiento de faltantes se rechaza toda variable con más de 99.00 % de valores faltantes.</w:t>
+        <w:t>En el tratamiento de faltantes se rechaza toda variable con más de 99,00 % de valores faltantes.</w:t>
       </w:r>
     </w:p>
     <w:p>
@@ -1240,7 +1240,7 @@
     </w:p>
     <w:p>
       <w:r>
-        <w:t>Sobre una exposición al incumplimiento (EAD) de $114.325.315, la pérdida crediticia esperada a constituir es $3.423.116, una cobertura del 2.99 %. Fecha de corte: 2025-06-30.</w:t>
+        <w:t>Sobre una exposición al incumplimiento (EAD) de $114.325.315, la pérdida crediticia esperada a constituir es $3.423.116, una cobertura del 2,99 %. Fecha de corte: 2025-06-30.</w:t>
       </w:r>
     </w:p>
     <w:p>
@@ -2558,7 +2558,7 @@
         <w:rPr>
           <w:rFonts w:ascii="Consolas" w:hAnsi="Consolas"/>
         </w:rPr>
-        <w:t>1865026045421cb43e4479a36335f7261ee0a0ea86cf40b7f87d654d16b81df6</w:t>
+        <w:t>cbe5d9fa856ae838623e88974bf1ea783825289ff8580c9b02098a0392c8f4d4</w:t>
       </w:r>
     </w:p>
     <w:p>
@@ -2574,7 +2574,7 @@
         <w:rPr>
           <w:rFonts w:ascii="Consolas" w:hAnsi="Consolas"/>
         </w:rPr>
-        <w:t>2026-07-20T18:38:12.216233Z</w:t>
+        <w:t>2026-07-21T01:18:51.899514Z</w:t>
       </w:r>
     </w:p>
     <w:p>
@@ -2638,7 +2638,7 @@
         <w:rPr>
           <w:rFonts w:ascii="Consolas" w:hAnsi="Consolas"/>
         </w:rPr>
-        <w:t>741a4031228596b874a291cc5dd490e6f34a8c39</w:t>
+        <w:t>91921e7fd5df1f9ba2f0379542198681e902c80c</w:t>
       </w:r>
     </w:p>
     <w:p>
@@ -2658,7 +2658,7 @@
         <w:br/>
         <w:t xml:space="preserve">  "PyYAML": "6.0.3",</w:t>
         <w:br/>
-        <w:t xml:space="preserve">  "nikodym": "1.3.0",</w:t>
+        <w:t xml:space="preserve">  "nikodym": "1.4.0",</w:t>
         <w:br/>
         <w:t xml:space="preserve">  "numpy": "2.4.6",</w:t>
         <w:br/>
@@ -2714,7 +2714,7 @@
         <w:rPr>
           <w:rFonts w:ascii="Consolas" w:hAnsi="Consolas"/>
         </w:rPr>
-        <w:t>No disponible</w:t>
+        <w:t>—</w:t>
       </w:r>
     </w:p>
     <w:p>
@@ -3286,7 +3286,7 @@
         <w:rPr>
           <w:rFonts w:ascii="Consolas" w:hAnsi="Consolas"/>
         </w:rPr>
-        <w:t>No disponible</w:t>
+        <w:t>—</w:t>
       </w:r>
     </w:p>
     <w:p>
@@ -3690,7 +3690,7 @@
         <w:rPr>
           <w:rFonts w:ascii="Consolas" w:hAnsi="Consolas"/>
         </w:rPr>
-        <w:t>none</w:t>
+        <w:t>—</w:t>
       </w:r>
     </w:p>
     <w:p>

</xml_diff>

<commit_message>
chore(demo): recapturar el bundle F4 sobre árbol limpio
Cifras insignia invariantes: S1 5.235 · S2 477 · S3 288 · EAD $114.325.315 ·
ECL $3.423.116 · cobertura 2,99 %. Los tres informes quedan sin la
declaración de no-reproducibilidad y sin celdas de monto crudas.
</commit_message>
<xml_diff>
--- a/web/src/fixtures/demo/report-ifrs9.docx
+++ b/web/src/fixtures/demo/report-ifrs9.docx
@@ -199,7 +199,7 @@
         <w:rPr>
           <w:rFonts w:ascii="Consolas" w:hAnsi="Consolas"/>
         </w:rPr>
-        <w:t>git_sha=88e0067e761252671b02016e74e329c5965da95d</w:t>
+        <w:t>git_sha=acb766325a501450ed2c3cc028f1a32fa057caa1</w:t>
       </w:r>
     </w:p>
     <w:p>
@@ -1469,7 +1469,7 @@
           </w:tcPr>
           <w:p>
             <w:r>
-              <w:t>31178795.530000</w:t>
+              <w:t>31178795.53</w:t>
             </w:r>
           </w:p>
         </w:tc>
@@ -1479,7 +1479,7 @@
           </w:tcPr>
           <w:p>
             <w:r>
-              <w:t>581332.243580</w:t>
+              <w:t>581332.24</w:t>
             </w:r>
           </w:p>
         </w:tc>
@@ -1555,7 +1555,7 @@
           </w:tcPr>
           <w:p>
             <w:r>
-              <w:t>3137275.520000</w:t>
+              <w:t>3137275.52</w:t>
             </w:r>
           </w:p>
         </w:tc>
@@ -1565,7 +1565,7 @@
           </w:tcPr>
           <w:p>
             <w:r>
-              <w:t>390914.010042</w:t>
+              <w:t>390914.01</w:t>
             </w:r>
           </w:p>
         </w:tc>
@@ -1641,7 +1641,7 @@
           </w:tcPr>
           <w:p>
             <w:r>
-              <w:t>2145243.750000</w:t>
+              <w:t>2145243.75</w:t>
             </w:r>
           </w:p>
         </w:tc>
@@ -1651,7 +1651,7 @@
           </w:tcPr>
           <w:p>
             <w:r>
-              <w:t>375806.682635</w:t>
+              <w:t>375806.68</w:t>
             </w:r>
           </w:p>
         </w:tc>
@@ -1727,7 +1727,7 @@
           </w:tcPr>
           <w:p>
             <w:r>
-              <w:t>18099269.130000</w:t>
+              <w:t>18099269.13</w:t>
             </w:r>
           </w:p>
         </w:tc>
@@ -1737,7 +1737,7 @@
           </w:tcPr>
           <w:p>
             <w:r>
-              <w:t>393131.231195</w:t>
+              <w:t>393131.23</w:t>
             </w:r>
           </w:p>
         </w:tc>
@@ -1813,7 +1813,7 @@
           </w:tcPr>
           <w:p>
             <w:r>
-              <w:t>1561397.650000</w:t>
+              <w:t>1561397.65</w:t>
             </w:r>
           </w:p>
         </w:tc>
@@ -1823,7 +1823,7 @@
           </w:tcPr>
           <w:p>
             <w:r>
-              <w:t>201559.528273</w:t>
+              <w:t>201559.53</w:t>
             </w:r>
           </w:p>
         </w:tc>
@@ -1899,7 +1899,7 @@
           </w:tcPr>
           <w:p>
             <w:r>
-              <w:t>990794.930000</w:t>
+              <w:t>990794.93</w:t>
             </w:r>
           </w:p>
         </w:tc>
@@ -1909,7 +1909,7 @@
           </w:tcPr>
           <w:p>
             <w:r>
-              <w:t>178471.854437</w:t>
+              <w:t>178471.85</w:t>
             </w:r>
           </w:p>
         </w:tc>
@@ -1985,7 +1985,7 @@
           </w:tcPr>
           <w:p>
             <w:r>
-              <w:t>43611647.090000</w:t>
+              <w:t>43611647.09</w:t>
             </w:r>
           </w:p>
         </w:tc>
@@ -1995,7 +1995,7 @@
           </w:tcPr>
           <w:p>
             <w:r>
-              <w:t>437771.237634</w:t>
+              <w:t>437771.24</w:t>
             </w:r>
           </w:p>
         </w:tc>
@@ -2071,7 +2071,7 @@
           </w:tcPr>
           <w:p>
             <w:r>
-              <w:t>3693801.390000</w:t>
+              <w:t>3693801.39</w:t>
             </w:r>
           </w:p>
         </w:tc>
@@ -2081,7 +2081,7 @@
           </w:tcPr>
           <w:p>
             <w:r>
-              <w:t>303704.226219</w:t>
+              <w:t>303704.23</w:t>
             </w:r>
           </w:p>
         </w:tc>
@@ -2157,7 +2157,7 @@
           </w:tcPr>
           <w:p>
             <w:r>
-              <w:t>2244951.100000</w:t>
+              <w:t>2244951.10</w:t>
             </w:r>
           </w:p>
         </w:tc>
@@ -2167,7 +2167,7 @@
           </w:tcPr>
           <w:p>
             <w:r>
-              <w:t>251942.927804</w:t>
+              <w:t>251942.93</w:t>
             </w:r>
           </w:p>
         </w:tc>
@@ -2243,7 +2243,7 @@
           </w:tcPr>
           <w:p>
             <w:r>
-              <w:t>6614503.170000</w:t>
+              <w:t>6614503.17</w:t>
             </w:r>
           </w:p>
         </w:tc>
@@ -2253,7 +2253,7 @@
           </w:tcPr>
           <w:p>
             <w:r>
-              <w:t>159269.346809</w:t>
+              <w:t>159269.35</w:t>
             </w:r>
           </w:p>
         </w:tc>
@@ -2329,7 +2329,7 @@
           </w:tcPr>
           <w:p>
             <w:r>
-              <w:t>672454.410000</w:t>
+              <w:t>672454.41</w:t>
             </w:r>
           </w:p>
         </w:tc>
@@ -2339,7 +2339,7 @@
           </w:tcPr>
           <w:p>
             <w:r>
-              <w:t>84444.873375</w:t>
+              <w:t>84444.87</w:t>
             </w:r>
           </w:p>
         </w:tc>
@@ -2415,7 +2415,7 @@
           </w:tcPr>
           <w:p>
             <w:r>
-              <w:t>375181.030000</w:t>
+              <w:t>375181.03</w:t>
             </w:r>
           </w:p>
         </w:tc>
@@ -2425,7 +2425,7 @@
           </w:tcPr>
           <w:p>
             <w:r>
-              <w:t>64767.956594</w:t>
+              <w:t>64767.96</w:t>
             </w:r>
           </w:p>
         </w:tc>
@@ -2521,11 +2521,6 @@
     </w:p>
     <w:p>
       <w:r>
-        <w:t>Caveats de reproducibilidad declarados por la corrida: working tree git sucio: cambios sin commitear no reconstruibles.</w:t>
-      </w:r>
-    </w:p>
-    <w:p>
-      <w:r>
         <w:t>No hay secciones obligatorias ausentes en esta corrida.</w:t>
       </w:r>
     </w:p>
@@ -2579,7 +2574,7 @@
         <w:rPr>
           <w:rFonts w:ascii="Consolas" w:hAnsi="Consolas"/>
         </w:rPr>
-        <w:t>2026-07-21T02:08:30.922789Z</w:t>
+        <w:t>2026-07-21T15:38:58.455777Z</w:t>
       </w:r>
     </w:p>
     <w:p>
@@ -2611,11 +2606,7 @@
         <w:rPr>
           <w:rFonts w:ascii="Consolas" w:hAnsi="Consolas"/>
         </w:rPr>
-        <w:t>[</w:t>
-        <w:br/>
-        <w:t xml:space="preserve">  "working tree git sucio: cambios sin commitear no reconstruibles"</w:t>
-        <w:br/>
-        <w:t>]</w:t>
+        <w:t>[]</w:t>
       </w:r>
     </w:p>
     <w:p>
@@ -2631,7 +2622,7 @@
         <w:rPr>
           <w:rFonts w:ascii="Consolas" w:hAnsi="Consolas"/>
         </w:rPr>
-        <w:t>true</w:t>
+        <w:t>false</w:t>
       </w:r>
     </w:p>
     <w:p>
@@ -2647,7 +2638,7 @@
         <w:rPr>
           <w:rFonts w:ascii="Consolas" w:hAnsi="Consolas"/>
         </w:rPr>
-        <w:t>88e0067e761252671b02016e74e329c5965da95d</w:t>
+        <w:t>acb766325a501450ed2c3cc028f1a32fa057caa1</w:t>
       </w:r>
     </w:p>
     <w:p>
@@ -3397,17 +3388,17 @@
         <w:br/>
         <w:t xml:space="preserve">  "fit_statistics": {</w:t>
         <w:br/>
-        <w:t xml:space="preserve">    "aic": "11002.310349",</w:t>
+        <w:t xml:space="preserve">    "aic": "11002.31",</w:t>
         <w:br/>
         <w:t xml:space="preserve">    "converged": "True",</w:t>
         <w:br/>
-        <w:t xml:space="preserve">    "deviance": "10984.310349",</w:t>
+        <w:t xml:space="preserve">    "deviance": "10984.31",</w:t>
         <w:br/>
         <w:t xml:space="preserve">    "df_model": 8,</w:t>
         <w:br/>
         <w:t xml:space="preserve">    "df_resid": 26636,</w:t>
         <w:br/>
-        <w:t xml:space="preserve">    "llf": "-5492.155174",</w:t>
+        <w:t xml:space="preserve">    "llf": "-5492.16",</w:t>
         <w:br/>
         <w:t xml:space="preserve">    "n_iterations": 6,</w:t>
         <w:br/>
@@ -4263,7 +4254,7 @@
         <w:rPr>
           <w:rFonts w:ascii="Consolas" w:hAnsi="Consolas"/>
         </w:rPr>
-        <w:t>114325314.700000</w:t>
+        <w:t>114325314.70</w:t>
       </w:r>
     </w:p>
     <w:p>
@@ -4279,7 +4270,7 @@
         <w:rPr>
           <w:rFonts w:ascii="Consolas" w:hAnsi="Consolas"/>
         </w:rPr>
-        <w:t>3423116.118598</w:t>
+        <w:t>3423116.12</w:t>
       </w:r>
     </w:p>
     <w:p>
@@ -4305,7 +4296,7 @@
         </w:rPr>
         <w:t>{</w:t>
         <w:br/>
-        <w:t xml:space="preserve">  "base": "6911516.428053"</w:t>
+        <w:t xml:space="preserve">  "base": "6911516.43"</w:t>
         <w:br/>
         <w:t>}</w:t>
       </w:r>

</xml_diff>

<commit_message>
chore(demo): recapturar F4 con lineage 1.4.1
</commit_message>
<xml_diff>
--- a/web/src/fixtures/demo/report-ifrs9.docx
+++ b/web/src/fixtures/demo/report-ifrs9.docx
@@ -199,7 +199,7 @@
         <w:rPr>
           <w:rFonts w:ascii="Consolas" w:hAnsi="Consolas"/>
         </w:rPr>
-        <w:t>git_sha=acb766325a501450ed2c3cc028f1a32fa057caa1</w:t>
+        <w:t>git_sha=f28d445d7b99fcd646bfd183205bf5d9efcfb95f</w:t>
       </w:r>
     </w:p>
     <w:p>
@@ -2574,7 +2574,7 @@
         <w:rPr>
           <w:rFonts w:ascii="Consolas" w:hAnsi="Consolas"/>
         </w:rPr>
-        <w:t>2026-07-21T15:38:58.455777Z</w:t>
+        <w:t>2026-07-21T17:01:39.670576Z</w:t>
       </w:r>
     </w:p>
     <w:p>
@@ -2638,7 +2638,7 @@
         <w:rPr>
           <w:rFonts w:ascii="Consolas" w:hAnsi="Consolas"/>
         </w:rPr>
-        <w:t>acb766325a501450ed2c3cc028f1a32fa057caa1</w:t>
+        <w:t>f28d445d7b99fcd646bfd183205bf5d9efcfb95f</w:t>
       </w:r>
     </w:p>
     <w:p>
@@ -2658,7 +2658,7 @@
         <w:br/>
         <w:t xml:space="preserve">  "PyYAML": "6.0.3",</w:t>
         <w:br/>
-        <w:t xml:space="preserve">  "nikodym": "1.4.0",</w:t>
+        <w:t xml:space="preserve">  "nikodym": "1.4.1",</w:t>
         <w:br/>
         <w:t xml:space="preserve">  "numpy": "2.4.6",</w:t>
         <w:br/>

</xml_diff>

<commit_message>
chore(demo): recapturar F4 sobre árbol limpio
</commit_message>
<xml_diff>
--- a/web/src/fixtures/demo/report-ifrs9.docx
+++ b/web/src/fixtures/demo/report-ifrs9.docx
@@ -199,7 +199,7 @@
         <w:rPr>
           <w:rFonts w:ascii="Consolas" w:hAnsi="Consolas"/>
         </w:rPr>
-        <w:t>git_sha=9b851201c8b66056dbc98947fef0c7d9a3877118</w:t>
+        <w:t>git_sha=fce5101d5c006a83f2962edcc701c0d6bf31f293</w:t>
       </w:r>
     </w:p>
     <w:p>
@@ -2521,11 +2521,6 @@
     </w:p>
     <w:p>
       <w:r>
-        <w:t>Caveats de reproducibilidad declarados por la corrida: working tree git sucio: cambios sin commitear no reconstruibles.</w:t>
-      </w:r>
-    </w:p>
-    <w:p>
-      <w:r>
         <w:t>No hay secciones obligatorias ausentes en esta corrida.</w:t>
       </w:r>
     </w:p>
@@ -2579,7 +2574,7 @@
         <w:rPr>
           <w:rFonts w:ascii="Consolas" w:hAnsi="Consolas"/>
         </w:rPr>
-        <w:t>2026-07-21T17:19:13.647215Z</w:t>
+        <w:t>2026-07-21T17:24:33.202587Z</w:t>
       </w:r>
     </w:p>
     <w:p>
@@ -2611,11 +2606,7 @@
         <w:rPr>
           <w:rFonts w:ascii="Consolas" w:hAnsi="Consolas"/>
         </w:rPr>
-        <w:t>[</w:t>
-        <w:br/>
-        <w:t xml:space="preserve">  "working tree git sucio: cambios sin commitear no reconstruibles"</w:t>
-        <w:br/>
-        <w:t>]</w:t>
+        <w:t>[]</w:t>
       </w:r>
     </w:p>
     <w:p>
@@ -2631,7 +2622,7 @@
         <w:rPr>
           <w:rFonts w:ascii="Consolas" w:hAnsi="Consolas"/>
         </w:rPr>
-        <w:t>true</w:t>
+        <w:t>false</w:t>
       </w:r>
     </w:p>
     <w:p>
@@ -2647,7 +2638,7 @@
         <w:rPr>
           <w:rFonts w:ascii="Consolas" w:hAnsi="Consolas"/>
         </w:rPr>
-        <w:t>9b851201c8b66056dbc98947fef0c7d9a3877118</w:t>
+        <w:t>fce5101d5c006a83f2962edcc701c0d6bf31f293</w:t>
       </w:r>
     </w:p>
     <w:p>

</xml_diff>

<commit_message>
chore(demo): recapturar F4 con lineage 1.5.0
Corrida real sobre arbol limpio (git_dirty=false). Cifras insignia
invariantes: EAD $114.325.315 · ECL reportada $3.423.116 · cobertura 2,99 % ·
S1 5.235 / S2 477 / S3 288.

Con esto los tres bundles quedan en 1.5.0 y con jerga interna cero verificada
sobre el artefacto (0 ocurrencias de SDD-/CT-N/@register/D-* en los HTML y los
JSON de la demo).

Co-Authored-By: Claude Opus 4.8 <noreply@anthropic.com>
</commit_message>
<xml_diff>
--- a/web/src/fixtures/demo/report-ifrs9.docx
+++ b/web/src/fixtures/demo/report-ifrs9.docx
@@ -163,7 +163,7 @@
           </w:tcPr>
           <w:p>
             <w:r>
-              <w:t>2026-07-21</w:t>
+              <w:t>2026-07-22</w:t>
             </w:r>
           </w:p>
         </w:tc>
@@ -199,7 +199,7 @@
         <w:rPr>
           <w:rFonts w:ascii="Consolas" w:hAnsi="Consolas"/>
         </w:rPr>
-        <w:t>git_sha=fce5101d5c006a83f2962edcc701c0d6bf31f293</w:t>
+        <w:t>git_sha=5f4a934eabef4be1a9d762c1cac3e6c3bb4d061a</w:t>
       </w:r>
     </w:p>
     <w:p>
@@ -2574,7 +2574,7 @@
         <w:rPr>
           <w:rFonts w:ascii="Consolas" w:hAnsi="Consolas"/>
         </w:rPr>
-        <w:t>2026-07-21T17:24:33.202587Z</w:t>
+        <w:t>2026-07-22T17:26:01.364397Z</w:t>
       </w:r>
     </w:p>
     <w:p>
@@ -2638,7 +2638,7 @@
         <w:rPr>
           <w:rFonts w:ascii="Consolas" w:hAnsi="Consolas"/>
         </w:rPr>
-        <w:t>fce5101d5c006a83f2962edcc701c0d6bf31f293</w:t>
+        <w:t>5f4a934eabef4be1a9d762c1cac3e6c3bb4d061a</w:t>
       </w:r>
     </w:p>
     <w:p>
@@ -2658,7 +2658,7 @@
         <w:br/>
         <w:t xml:space="preserve">  "PyYAML": "6.0.3",</w:t>
         <w:br/>
-        <w:t xml:space="preserve">  "nikodym": "1.4.1",</w:t>
+        <w:t xml:space="preserve">  "nikodym": "1.5.0",</w:t>
         <w:br/>
         <w:t xml:space="preserve">  "numpy": "2.4.6",</w:t>
         <w:br/>
@@ -4299,6 +4299,22 @@
         <w:t xml:space="preserve">  "base": "6911516.43"</w:t>
         <w:br/>
         <w:t>}</w:t>
+      </w:r>
+    </w:p>
+    <w:p>
+      <w:r>
+        <w:rPr>
+          <w:b/>
+        </w:rPr>
+        <w:t>ecl_by_scenario_basis</w:t>
+      </w:r>
+    </w:p>
+    <w:p>
+      <w:r>
+        <w:rPr>
+          <w:rFonts w:ascii="Consolas" w:hAnsi="Consolas"/>
+        </w:rPr>
+        <w:t>Diagnóstico auditable de la term-structure, no un desglose de total_ecl_reported: suma la ECL marginal descontada de cada escenario por separado, sin aplicar scenario_weights y sobre el horizonte completo de la curva, sin truncar Stage 1 a 12 meses. total_ecl_reported sí pondera por escenario y aplica ese corte por stage, de modo que ambas cifras no reconcilian entre sí: no deben sumarse ni compararse.</w:t>
       </w:r>
     </w:p>
     <w:p>

</xml_diff>

<commit_message>
chore(demo): recaptura IFRS 9 sobre árbol limpio
Mismo defecto que F3 y por la misma causa: la captura anterior corrió con el
árbol sucio —de hecho, con los fixtures de F3 recién escritos encima—, así que el
informe publicaba `git_dirty=true` y dos caveats de irreproducibilidad. La
lección operativa es que las capturas no se encadenan: cada una necesita el árbol
limpio, así que va commit entre medio.

`git_dirty=false`, cero caveats, y los números insignia sin moverse:
EAD 114.325.315 · ECL 3.423.116 · cobertura 2,99 % · S1 5.235 / S2 477 / S3 288.

Queda anotado que `report-f1.html` arrastra `git_dirty=true` de una captura
anterior a esta sesión. No lo recapturo: nada de lo cambiado hoy le afecta, y
hacerlo movería su `run_id` sin motivo.
</commit_message>
<xml_diff>
--- a/web/src/fixtures/demo/report-ifrs9.docx
+++ b/web/src/fixtures/demo/report-ifrs9.docx
@@ -199,7 +199,7 @@
         <w:rPr>
           <w:rFonts w:ascii="Consolas" w:hAnsi="Consolas"/>
         </w:rPr>
-        <w:t>git_sha=c6580a0aa171898adac14fe7388a973c4ed219d0</w:t>
+        <w:t>git_sha=6fd9af0b5b9aa6e7a12f31bb90030ef431ef1687</w:t>
       </w:r>
     </w:p>
     <w:p>
@@ -2339,11 +2339,6 @@
     </w:p>
     <w:p>
       <w:r>
-        <w:t>Caveats de reproducibilidad declarados por la corrida: working tree git sucio: cambios sin commitear no reconstruibles.</w:t>
-      </w:r>
-    </w:p>
-    <w:p>
-      <w:r>
         <w:t>No hay secciones obligatorias ausentes en esta corrida.</w:t>
       </w:r>
     </w:p>
@@ -2397,7 +2392,7 @@
         <w:rPr>
           <w:rFonts w:ascii="Consolas" w:hAnsi="Consolas"/>
         </w:rPr>
-        <w:t>2026-07-25T03:51:10.956571Z</w:t>
+        <w:t>2026-07-25T04:10:37.644929Z</w:t>
       </w:r>
     </w:p>
     <w:p>
@@ -2429,11 +2424,7 @@
         <w:rPr>
           <w:rFonts w:ascii="Consolas" w:hAnsi="Consolas"/>
         </w:rPr>
-        <w:t>[</w:t>
-        <w:br/>
-        <w:t xml:space="preserve">  "working tree git sucio: cambios sin commitear no reconstruibles"</w:t>
-        <w:br/>
-        <w:t>]</w:t>
+        <w:t>[]</w:t>
       </w:r>
     </w:p>
     <w:p>
@@ -2449,7 +2440,7 @@
         <w:rPr>
           <w:rFonts w:ascii="Consolas" w:hAnsi="Consolas"/>
         </w:rPr>
-        <w:t>true</w:t>
+        <w:t>false</w:t>
       </w:r>
     </w:p>
     <w:p>
@@ -2465,7 +2456,7 @@
         <w:rPr>
           <w:rFonts w:ascii="Consolas" w:hAnsi="Consolas"/>
         </w:rPr>
-        <w:t>c6580a0aa171898adac14fe7388a973c4ed219d0</w:t>
+        <w:t>6fd9af0b5b9aa6e7a12f31bb90030ef431ef1687</w:t>
       </w:r>
     </w:p>
     <w:p>

</xml_diff>

<commit_message>
chore(demo): recaptura IFRS 9, con el esquema de segmentación en la card
El set IFRS 9 traía el config_hash y la card anteriores a los campos de segmentación.
Recaptura desde corrida real con árbol limpio.

Verificado sobre el artefacto: 6000 filas, S1=5235 S2=477 S3=288, EAD 114,3M, ECL 3,42M
(cobertura 2,99%), y la distribución de staging reconcilia con la card.
</commit_message>
<xml_diff>
--- a/web/src/fixtures/demo/report-ifrs9.docx
+++ b/web/src/fixtures/demo/report-ifrs9.docx
@@ -183,7 +183,7 @@
         <w:rPr>
           <w:rFonts w:ascii="Consolas" w:hAnsi="Consolas"/>
         </w:rPr>
-        <w:t>config_hash=cbe5d9fa856ae838623e88974bf1ea783825289ff8580c9b02098a0392c8f4d4</w:t>
+        <w:t>config_hash=92163dd24fced5a0dd0a8c4ae971481502f3a396b9014eafb3205f78c7491660</w:t>
       </w:r>
     </w:p>
     <w:p>
@@ -199,7 +199,7 @@
         <w:rPr>
           <w:rFonts w:ascii="Consolas" w:hAnsi="Consolas"/>
         </w:rPr>
-        <w:t>git_sha=6fd9af0b5b9aa6e7a12f31bb90030ef431ef1687</w:t>
+        <w:t>git_sha=285170aa4efbf9bfb2c2d4e01b51ad464c1ddebb</w:t>
       </w:r>
     </w:p>
     <w:p>
@@ -2376,7 +2376,7 @@
         <w:rPr>
           <w:rFonts w:ascii="Consolas" w:hAnsi="Consolas"/>
         </w:rPr>
-        <w:t>cbe5d9fa856ae838623e88974bf1ea783825289ff8580c9b02098a0392c8f4d4</w:t>
+        <w:t>92163dd24fced5a0dd0a8c4ae971481502f3a396b9014eafb3205f78c7491660</w:t>
       </w:r>
     </w:p>
     <w:p>
@@ -2392,7 +2392,7 @@
         <w:rPr>
           <w:rFonts w:ascii="Consolas" w:hAnsi="Consolas"/>
         </w:rPr>
-        <w:t>2026-07-25T04:10:37.644929Z</w:t>
+        <w:t>2026-07-25T22:26:29.896760Z</w:t>
       </w:r>
     </w:p>
     <w:p>
@@ -2456,7 +2456,7 @@
         <w:rPr>
           <w:rFonts w:ascii="Consolas" w:hAnsi="Consolas"/>
         </w:rPr>
-        <w:t>6fd9af0b5b9aa6e7a12f31bb90030ef431ef1687</w:t>
+        <w:t>285170aa4efbf9bfb2c2d4e01b51ad464c1ddebb</w:t>
       </w:r>
     </w:p>
     <w:p>
@@ -3854,6 +3854,8 @@
         <w:br/>
         <w:t xml:space="preserve">  "portfolio_col": "portfolio",</w:t>
         <w:br/>
+        <w:t xml:space="preserve">  "portfolio_scheme": null,</w:t>
+        <w:br/>
         <w:t xml:space="preserve">  "row_id_col": null,</w:t>
         <w:br/>
         <w:t xml:space="preserve">  "scenarios": {</w:t>
@@ -4041,6 +4043,22 @@
         <w:t xml:space="preserve">  "base"</w:t>
         <w:br/>
         <w:t>]</w:t>
+      </w:r>
+    </w:p>
+    <w:p>
+      <w:r>
+        <w:rPr>
+          <w:b/>
+        </w:rPr>
+        <w:t>segmentation</w:t>
+      </w:r>
+    </w:p>
+    <w:p>
+      <w:r>
+        <w:rPr>
+          <w:rFonts w:ascii="Consolas" w:hAnsi="Consolas"/>
+        </w:rPr>
+        <w:t>—</w:t>
       </w:r>
     </w:p>
     <w:p>

</xml_diff>

<commit_message>
chore(demo): recaptura IFRS 9 con el config_hash de D-CRP6-8 y lineage 1.6.0
Tercera y última del patrón C-D, y la única que además del bump arrastra el
config_hash nuevo: el fixture traía `confidence_level: null` mientras el paquete
instalado ya declaraba 0.95. Verificado sobre el artefacto escrito, no sobre el
código: el hash del fixture coincide con el golden y con el preset vivo, y la
corrida real reconcilia (S1=5235 S2=477 S3=288, coverage 2.99%).
</commit_message>
<xml_diff>
--- a/web/src/fixtures/demo/report-ifrs9.docx
+++ b/web/src/fixtures/demo/report-ifrs9.docx
@@ -163,7 +163,7 @@
           </w:tcPr>
           <w:p>
             <w:r>
-              <w:t>2026-07-25</w:t>
+              <w:t>2026-07-26</w:t>
             </w:r>
           </w:p>
         </w:tc>
@@ -183,7 +183,7 @@
         <w:rPr>
           <w:rFonts w:ascii="Consolas" w:hAnsi="Consolas"/>
         </w:rPr>
-        <w:t>config_hash=92163dd24fced5a0dd0a8c4ae971481502f3a396b9014eafb3205f78c7491660</w:t>
+        <w:t>config_hash=013e69dc4c96e03ee87e9f3f54bcf5e1f6e6fd56b5a1b1ffdd5bf021093360b6</w:t>
       </w:r>
     </w:p>
     <w:p>
@@ -199,7 +199,7 @@
         <w:rPr>
           <w:rFonts w:ascii="Consolas" w:hAnsi="Consolas"/>
         </w:rPr>
-        <w:t>git_sha=285170aa4efbf9bfb2c2d4e01b51ad464c1ddebb</w:t>
+        <w:t>git_sha=8a7916bf76c9ccb3737ad0658b632b1cc14779ab</w:t>
       </w:r>
     </w:p>
     <w:p>
@@ -2376,7 +2376,7 @@
         <w:rPr>
           <w:rFonts w:ascii="Consolas" w:hAnsi="Consolas"/>
         </w:rPr>
-        <w:t>92163dd24fced5a0dd0a8c4ae971481502f3a396b9014eafb3205f78c7491660</w:t>
+        <w:t>013e69dc4c96e03ee87e9f3f54bcf5e1f6e6fd56b5a1b1ffdd5bf021093360b6</w:t>
       </w:r>
     </w:p>
     <w:p>
@@ -2392,7 +2392,7 @@
         <w:rPr>
           <w:rFonts w:ascii="Consolas" w:hAnsi="Consolas"/>
         </w:rPr>
-        <w:t>2026-07-25T22:26:29.896760Z</w:t>
+        <w:t>2026-07-26T16:27:48.687279Z</w:t>
       </w:r>
     </w:p>
     <w:p>
@@ -2456,7 +2456,7 @@
         <w:rPr>
           <w:rFonts w:ascii="Consolas" w:hAnsi="Consolas"/>
         </w:rPr>
-        <w:t>285170aa4efbf9bfb2c2d4e01b51ad464c1ddebb</w:t>
+        <w:t>8a7916bf76c9ccb3737ad0658b632b1cc14779ab</w:t>
       </w:r>
     </w:p>
     <w:p>
@@ -2476,7 +2476,7 @@
         <w:br/>
         <w:t xml:space="preserve">  "PyYAML": "6.0.3",</w:t>
         <w:br/>
-        <w:t xml:space="preserve">  "nikodym": "1.5.0",</w:t>
+        <w:t xml:space="preserve">  "nikodym": "1.6.0",</w:t>
         <w:br/>
         <w:t xml:space="preserve">  "numpy": "2.4.6",</w:t>
         <w:br/>
@@ -3330,9 +3330,9 @@
         <w:br/>
         <w:t xml:space="preserve">  "kaplan_meier": {</w:t>
         <w:br/>
-        <w:t xml:space="preserve">    "confidence_level": null,</w:t>
-        <w:br/>
-        <w:t xml:space="preserve">    "confidence_transform": null</w:t>
+        <w:t xml:space="preserve">    "confidence_level": "0.950000",</w:t>
+        <w:br/>
+        <w:t xml:space="preserve">    "confidence_transform": "loglog"</w:t>
         <w:br/>
         <w:t xml:space="preserve">  },</w:t>
         <w:br/>

</xml_diff>

<commit_message>
chore(demo): recaptura del bundle F4 — la demo afirmaba una partición que su corrida nunca usó
Tercer eslabón de la cadena C→D, y el que motivaba la recaptura. El informe
IFRS 9 publicado decía «La población se particionó por cohorte sobre
«cohorte», reservando como OOT la cohorte «2024Q2»…» sobre una corrida donde
ninguna etapa consume esa división. D-COL-9 lo gateó por consumo real y la
frase pasa a ser la honesta: la cartera se dividió al preparar los datos,
pero la tabla del capítulo describe la cartera, no una muestra de trabajo.
Nada lo comparaba, así que ningún test lo veía.

Con ello se corrigen otros dos rezagos del fixture, que llevaba desde el 27
de julio: declaraba `nikodym 1.6.0` —cuatro releases atrás— y no publicaba el
`fit_scope` de survival, que D-SUR-13 añadió para que el ajuste declare sobre
qué población corrió en vez de callarlo.

Cifras invariantes: EAD $114.325.315, ECL $3.423.116, coverage 2,99 %,
S1 5.235 / S2 477 / S3 288.
</commit_message>
<xml_diff>
--- a/web/src/fixtures/demo/report-ifrs9.docx
+++ b/web/src/fixtures/demo/report-ifrs9.docx
@@ -163,7 +163,7 @@
           </w:tcPr>
           <w:p>
             <w:r>
-              <w:t>2026-07-27</w:t>
+              <w:t>2026-08-03</w:t>
             </w:r>
           </w:p>
         </w:tc>
@@ -199,7 +199,7 @@
         <w:rPr>
           <w:rFonts w:ascii="Consolas" w:hAnsi="Consolas"/>
         </w:rPr>
-        <w:t>git_sha=52103fcd695abed351db36d41c97418955cbf0a0</w:t>
+        <w:t>git_sha=25896302ed89f951453e305436b614347ea15e30</w:t>
       </w:r>
     </w:p>
     <w:p>
@@ -698,7 +698,7 @@
     </w:p>
     <w:p>
       <w:r>
-        <w:t>La población se particionó por cohorte sobre «cohorte», reservando como OOT la cohorte «2024Q2», y un Holdout de 20,00 % del resto.</w:t>
+        <w:t>La cartera se dividió en muestras al preparar los datos, pero ninguna etapa de esta corrida se apoyó en esa división: la tabla de particiones de este capítulo describe la cartera, no una muestra de trabajo.</w:t>
       </w:r>
     </w:p>
     <w:p>
@@ -2392,7 +2392,7 @@
         <w:rPr>
           <w:rFonts w:ascii="Consolas" w:hAnsi="Consolas"/>
         </w:rPr>
-        <w:t>2026-07-27T14:06:26.129376Z</w:t>
+        <w:t>2026-08-03T00:06:07.754792Z</w:t>
       </w:r>
     </w:p>
     <w:p>
@@ -2456,7 +2456,7 @@
         <w:rPr>
           <w:rFonts w:ascii="Consolas" w:hAnsi="Consolas"/>
         </w:rPr>
-        <w:t>52103fcd695abed351db36d41c97418955cbf0a0</w:t>
+        <w:t>25896302ed89f951453e305436b614347ea15e30</w:t>
       </w:r>
     </w:p>
     <w:p>
@@ -2476,7 +2476,7 @@
         <w:br/>
         <w:t xml:space="preserve">  "PyYAML": "6.0.3",</w:t>
         <w:br/>
-        <w:t xml:space="preserve">  "nikodym": "1.6.0",</w:t>
+        <w:t xml:space="preserve">  "nikodym": "1.10.0",</w:t>
         <w:br/>
         <w:t xml:space="preserve">  "numpy": "2.4.6",</w:t>
         <w:br/>
@@ -3535,6 +3535,30 @@
       </w:pPr>
       <w:r>
         <w:t>Métricas estructuradas</w:t>
+      </w:r>
+    </w:p>
+    <w:p>
+      <w:r>
+        <w:rPr>
+          <w:b/>
+        </w:rPr>
+        <w:t>fit_scope</w:t>
+      </w:r>
+    </w:p>
+    <w:p>
+      <w:r>
+        <w:rPr>
+          <w:rFonts w:ascii="Consolas" w:hAnsi="Consolas"/>
+        </w:rPr>
+        <w:t>{</w:t>
+        <w:br/>
+        <w:t xml:space="preserve">  "n_fit_rows": 6000,</w:t>
+        <w:br/>
+        <w:t xml:space="preserve">  "n_rows": 6000,</w:t>
+        <w:br/>
+        <w:t xml:space="preserve">  "scope": "poblacion_completa"</w:t>
+        <w:br/>
+        <w:t>}</w:t>
       </w:r>
     </w:p>
     <w:p>

</xml_diff>

<commit_message>
Recaptura demo IFRS 9 con prosa factual
</commit_message>
<xml_diff>
--- a/web/src/fixtures/demo/report-ifrs9.docx
+++ b/web/src/fixtures/demo/report-ifrs9.docx
@@ -163,7 +163,7 @@
           </w:tcPr>
           <w:p>
             <w:r>
-              <w:t>2026-08-03</w:t>
+              <w:t>2026-08-09</w:t>
             </w:r>
           </w:p>
         </w:tc>
@@ -199,7 +199,7 @@
         <w:rPr>
           <w:rFonts w:ascii="Consolas" w:hAnsi="Consolas"/>
         </w:rPr>
-        <w:t>git_sha=25896302ed89f951453e305436b614347ea15e30</w:t>
+        <w:t>git_sha=ec5fbf7d41f8ec25ae228eca39cb72ece22ae18b</w:t>
       </w:r>
     </w:p>
     <w:p>
@@ -477,7 +477,7 @@
           </w:tcPr>
           <w:p>
             <w:r>
-              <w:t>Cartera total · CLP</w:t>
+              <w:t>Cartera total</w:t>
             </w:r>
           </w:p>
         </w:tc>
@@ -519,7 +519,7 @@
           </w:tcPr>
           <w:p>
             <w:r>
-              <w:t>Cartera total · CLP</w:t>
+              <w:t>Cartera total</w:t>
             </w:r>
           </w:p>
         </w:tc>
@@ -1149,7 +1149,7 @@
     </w:p>
     <w:p>
       <w:r>
-        <w:t>En el tratamiento de faltantes se rechaza toda variable con más de 99,00 % de valores faltantes.</w:t>
+        <w:t>En el tratamiento de faltantes se reporta para revisión toda variable con más de 99,00 % de valores faltantes, sin eliminarla automáticamente.</w:t>
       </w:r>
     </w:p>
     <w:p>
@@ -1240,7 +1240,7 @@
     </w:p>
     <w:p>
       <w:r>
-        <w:t>Sobre una exposición al incumplimiento (EAD) de $114.325.315, la pérdida crediticia esperada a constituir es $3.423.116, una cobertura del 2,99 %. Los montos van en pesos chilenos (CLP). Fecha de corte: 2025-06-30.</w:t>
+        <w:t>Sobre una exposición al incumplimiento (EAD) de $114.325.315, la pérdida crediticia esperada a constituir es $3.423.116, una cobertura del 2,99 %. Fecha de corte: 2025-06-30.</w:t>
       </w:r>
     </w:p>
     <w:p>
@@ -2392,7 +2392,7 @@
         <w:rPr>
           <w:rFonts w:ascii="Consolas" w:hAnsi="Consolas"/>
         </w:rPr>
-        <w:t>2026-08-03T00:06:07.754792Z</w:t>
+        <w:t>2026-08-09T18:46:18.616398Z</w:t>
       </w:r>
     </w:p>
     <w:p>
@@ -2456,7 +2456,7 @@
         <w:rPr>
           <w:rFonts w:ascii="Consolas" w:hAnsi="Consolas"/>
         </w:rPr>
-        <w:t>25896302ed89f951453e305436b614347ea15e30</w:t>
+        <w:t>ec5fbf7d41f8ec25ae228eca39cb72ece22ae18b</w:t>
       </w:r>
     </w:p>
     <w:p>
@@ -2476,7 +2476,7 @@
         <w:br/>
         <w:t xml:space="preserve">  "PyYAML": "6.0.3",</w:t>
         <w:br/>
-        <w:t xml:space="preserve">  "nikodym": "1.10.0",</w:t>
+        <w:t xml:space="preserve">  "nikodym": "1.11.0",</w:t>
         <w:br/>
         <w:t xml:space="preserve">  "numpy": "2.4.6",</w:t>
         <w:br/>

</xml_diff>

<commit_message>
test: recaptura demo IFRS 9 factual
</commit_message>
<xml_diff>
--- a/web/src/fixtures/demo/report-ifrs9.docx
+++ b/web/src/fixtures/demo/report-ifrs9.docx
@@ -199,7 +199,7 @@
         <w:rPr>
           <w:rFonts w:ascii="Consolas" w:hAnsi="Consolas"/>
         </w:rPr>
-        <w:t>git_sha=ec5fbf7d41f8ec25ae228eca39cb72ece22ae18b</w:t>
+        <w:t>git_sha=2481b403be23bfd7d62369a0e93c05688b134b7a</w:t>
       </w:r>
     </w:p>
     <w:p>
@@ -2392,7 +2392,7 @@
         <w:rPr>
           <w:rFonts w:ascii="Consolas" w:hAnsi="Consolas"/>
         </w:rPr>
-        <w:t>2026-08-09T18:46:18.616398Z</w:t>
+        <w:t>2026-08-09T19:39:15.546195Z</w:t>
       </w:r>
     </w:p>
     <w:p>
@@ -2456,7 +2456,7 @@
         <w:rPr>
           <w:rFonts w:ascii="Consolas" w:hAnsi="Consolas"/>
         </w:rPr>
-        <w:t>ec5fbf7d41f8ec25ae228eca39cb72ece22ae18b</w:t>
+        <w:t>2481b403be23bfd7d62369a0e93c05688b134b7a</w:t>
       </w:r>
     </w:p>
     <w:p>

</xml_diff>